<commit_message>
use new match preview template
</commit_message>
<xml_diff>
--- a/src/main/resources/pictures/template/men/matchdayTemp.docx
+++ b/src/main/resources/pictures/template/men/matchdayTemp.docx
@@ -7,266 +7,7 @@
         <w:tabs>
           <w:tab w:val="left" w:pos="284"/>
         </w:tabs>
-        <w:ind w:firstLine="142"/>
-      </w:pPr>
-      <w:r>
-        <w:rPr>
-          <w:noProof/>
-        </w:rPr>
-        <mc:AlternateContent>
-          <mc:Choice Requires="wps">
-            <w:drawing>
-              <wp:anchor distT="0" distB="0" distL="114300" distR="114300" simplePos="0" relativeHeight="251735040" behindDoc="0" locked="0" layoutInCell="1" allowOverlap="1" wp14:anchorId="034EC9C9" wp14:editId="561490A5">
-                <wp:simplePos x="0" y="0"/>
-                <wp:positionH relativeFrom="column">
-                  <wp:posOffset>4881965</wp:posOffset>
-                </wp:positionH>
-                <wp:positionV relativeFrom="paragraph">
-                  <wp:posOffset>4837685</wp:posOffset>
-                </wp:positionV>
-                <wp:extent cx="1266433" cy="8856"/>
-                <wp:effectExtent l="0" t="0" r="29210" b="29845"/>
-                <wp:wrapNone/>
-                <wp:docPr id="553423310" name="Gerader Verbinder 3"/>
-                <wp:cNvGraphicFramePr/>
-                <a:graphic xmlns:a="http://schemas.openxmlformats.org/drawingml/2006/main">
-                  <a:graphicData uri="http://schemas.microsoft.com/office/word/2010/wordprocessingShape">
-                    <wps:wsp>
-                      <wps:cNvCnPr/>
-                      <wps:spPr>
-                        <a:xfrm>
-                          <a:off x="0" y="0"/>
-                          <a:ext cx="1266433" cy="8856"/>
-                        </a:xfrm>
-                        <a:prstGeom prst="line">
-                          <a:avLst/>
-                        </a:prstGeom>
-                      </wps:spPr>
-                      <wps:style>
-                        <a:lnRef idx="1">
-                          <a:schemeClr val="accent1"/>
-                        </a:lnRef>
-                        <a:fillRef idx="0">
-                          <a:schemeClr val="accent1"/>
-                        </a:fillRef>
-                        <a:effectRef idx="0">
-                          <a:schemeClr val="accent1"/>
-                        </a:effectRef>
-                        <a:fontRef idx="minor">
-                          <a:schemeClr val="tx1"/>
-                        </a:fontRef>
-                      </wps:style>
-                      <wps:bodyPr/>
-                    </wps:wsp>
-                  </a:graphicData>
-                </a:graphic>
-                <wp14:sizeRelH relativeFrom="margin">
-                  <wp14:pctWidth>0</wp14:pctWidth>
-                </wp14:sizeRelH>
-                <wp14:sizeRelV relativeFrom="margin">
-                  <wp14:pctHeight>0</wp14:pctHeight>
-                </wp14:sizeRelV>
-              </wp:anchor>
-            </w:drawing>
-          </mc:Choice>
-          <mc:Fallback>
-            <w:pict>
-              <v:line w14:anchorId="791391FE" id="Gerader Verbinder 3" o:spid="_x0000_s1026" style="position:absolute;z-index:251735040;visibility:visible;mso-wrap-style:square;mso-width-percent:0;mso-height-percent:0;mso-wrap-distance-left:9pt;mso-wrap-distance-top:0;mso-wrap-distance-right:9pt;mso-wrap-distance-bottom:0;mso-position-horizontal:absolute;mso-position-horizontal-relative:text;mso-position-vertical:absolute;mso-position-vertical-relative:text;mso-width-percent:0;mso-height-percent:0;mso-width-relative:margin;mso-height-relative:margin" from="384.4pt,380.9pt" to="484.1pt,381.6pt" o:gfxdata="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" strokecolor="#4472c4 [3204]" strokeweight=".5pt">
-                <v:stroke joinstyle="miter"/>
-              </v:line>
-            </w:pict>
-          </mc:Fallback>
-        </mc:AlternateContent>
-      </w:r>
-      <w:r>
-        <w:rPr>
-          <w:noProof/>
-        </w:rPr>
-        <mc:AlternateContent>
-          <mc:Choice Requires="wps">
-            <w:drawing>
-              <wp:anchor distT="0" distB="0" distL="114300" distR="114300" simplePos="0" relativeHeight="251734016" behindDoc="0" locked="0" layoutInCell="1" allowOverlap="1" wp14:anchorId="6BE98CB1" wp14:editId="15201C67">
-                <wp:simplePos x="0" y="0"/>
-                <wp:positionH relativeFrom="column">
-                  <wp:posOffset>6050280</wp:posOffset>
-                </wp:positionH>
-                <wp:positionV relativeFrom="paragraph">
-                  <wp:posOffset>3657600</wp:posOffset>
-                </wp:positionV>
-                <wp:extent cx="0" cy="1322748"/>
-                <wp:effectExtent l="0" t="0" r="38100" b="29845"/>
-                <wp:wrapNone/>
-                <wp:docPr id="912614255" name="Gerader Verbinder 2"/>
-                <wp:cNvGraphicFramePr/>
-                <a:graphic xmlns:a="http://schemas.openxmlformats.org/drawingml/2006/main">
-                  <a:graphicData uri="http://schemas.microsoft.com/office/word/2010/wordprocessingShape">
-                    <wps:wsp>
-                      <wps:cNvCnPr/>
-                      <wps:spPr>
-                        <a:xfrm>
-                          <a:off x="0" y="0"/>
-                          <a:ext cx="0" cy="1322748"/>
-                        </a:xfrm>
-                        <a:prstGeom prst="line">
-                          <a:avLst/>
-                        </a:prstGeom>
-                      </wps:spPr>
-                      <wps:style>
-                        <a:lnRef idx="1">
-                          <a:schemeClr val="accent1"/>
-                        </a:lnRef>
-                        <a:fillRef idx="0">
-                          <a:schemeClr val="accent1"/>
-                        </a:fillRef>
-                        <a:effectRef idx="0">
-                          <a:schemeClr val="accent1"/>
-                        </a:effectRef>
-                        <a:fontRef idx="minor">
-                          <a:schemeClr val="tx1"/>
-                        </a:fontRef>
-                      </wps:style>
-                      <wps:bodyPr/>
-                    </wps:wsp>
-                  </a:graphicData>
-                </a:graphic>
-              </wp:anchor>
-            </w:drawing>
-          </mc:Choice>
-          <mc:Fallback>
-            <w:pict>
-              <v:line w14:anchorId="5DC4E9AB" id="Gerader Verbinder 2" o:spid="_x0000_s1026" style="position:absolute;z-index:251734016;visibility:visible;mso-wrap-style:square;mso-wrap-distance-left:9pt;mso-wrap-distance-top:0;mso-wrap-distance-right:9pt;mso-wrap-distance-bottom:0;mso-position-horizontal:absolute;mso-position-horizontal-relative:text;mso-position-vertical:absolute;mso-position-vertical-relative:text" from="476.4pt,4in" to="476.4pt,392.15pt" o:gfxdata="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" strokecolor="#4472c4 [3204]" strokeweight=".5pt">
-                <v:stroke joinstyle="miter"/>
-              </v:line>
-            </w:pict>
-          </mc:Fallback>
-        </mc:AlternateContent>
-      </w:r>
-      <w:r>
-        <w:rPr>
-          <w:noProof/>
-        </w:rPr>
-        <mc:AlternateContent>
-          <mc:Choice Requires="wps">
-            <w:drawing>
-              <wp:anchor distT="0" distB="0" distL="114300" distR="114300" simplePos="0" relativeHeight="251730944" behindDoc="0" locked="0" layoutInCell="1" allowOverlap="1" wp14:anchorId="3A217425" wp14:editId="6378964B">
-                <wp:simplePos x="0" y="0"/>
-                <wp:positionH relativeFrom="column">
-                  <wp:posOffset>2609033</wp:posOffset>
-                </wp:positionH>
-                <wp:positionV relativeFrom="paragraph">
-                  <wp:posOffset>12383770</wp:posOffset>
-                </wp:positionV>
-                <wp:extent cx="0" cy="1252675"/>
-                <wp:effectExtent l="0" t="0" r="38100" b="24130"/>
-                <wp:wrapNone/>
-                <wp:docPr id="301925309" name="Gerader Verbinder 1"/>
-                <wp:cNvGraphicFramePr/>
-                <a:graphic xmlns:a="http://schemas.openxmlformats.org/drawingml/2006/main">
-                  <a:graphicData uri="http://schemas.microsoft.com/office/word/2010/wordprocessingShape">
-                    <wps:wsp>
-                      <wps:cNvCnPr/>
-                      <wps:spPr>
-                        <a:xfrm>
-                          <a:off x="0" y="0"/>
-                          <a:ext cx="0" cy="1252675"/>
-                        </a:xfrm>
-                        <a:prstGeom prst="line">
-                          <a:avLst/>
-                        </a:prstGeom>
-                      </wps:spPr>
-                      <wps:style>
-                        <a:lnRef idx="1">
-                          <a:schemeClr val="accent1"/>
-                        </a:lnRef>
-                        <a:fillRef idx="0">
-                          <a:schemeClr val="accent1"/>
-                        </a:fillRef>
-                        <a:effectRef idx="0">
-                          <a:schemeClr val="accent1"/>
-                        </a:effectRef>
-                        <a:fontRef idx="minor">
-                          <a:schemeClr val="tx1"/>
-                        </a:fontRef>
-                      </wps:style>
-                      <wps:bodyPr/>
-                    </wps:wsp>
-                  </a:graphicData>
-                </a:graphic>
-              </wp:anchor>
-            </w:drawing>
-          </mc:Choice>
-          <mc:Fallback>
-            <w:pict>
-              <v:line w14:anchorId="293538CF" id="Gerader Verbinder 1" o:spid="_x0000_s1026" style="position:absolute;z-index:251730944;visibility:visible;mso-wrap-style:square;mso-wrap-distance-left:9pt;mso-wrap-distance-top:0;mso-wrap-distance-right:9pt;mso-wrap-distance-bottom:0;mso-position-horizontal:absolute;mso-position-horizontal-relative:text;mso-position-vertical:absolute;mso-position-vertical-relative:text" from="205.45pt,975.1pt" to="205.45pt,1073.75pt" o:gfxdata="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" strokecolor="#4472c4 [3204]" strokeweight=".5pt">
-                <v:stroke joinstyle="miter"/>
-              </v:line>
-            </w:pict>
-          </mc:Fallback>
-        </mc:AlternateContent>
-      </w:r>
-      <w:r>
-        <w:rPr>
-          <w:noProof/>
-        </w:rPr>
-        <mc:AlternateContent>
-          <mc:Choice Requires="wps">
-            <w:drawing>
-              <wp:anchor distT="0" distB="0" distL="114300" distR="114300" simplePos="0" relativeHeight="251732992" behindDoc="0" locked="0" layoutInCell="1" allowOverlap="1" wp14:anchorId="003374EB" wp14:editId="70B9E365">
-                <wp:simplePos x="0" y="0"/>
-                <wp:positionH relativeFrom="column">
-                  <wp:posOffset>5624298</wp:posOffset>
-                </wp:positionH>
-                <wp:positionV relativeFrom="paragraph">
-                  <wp:posOffset>12298399</wp:posOffset>
-                </wp:positionV>
-                <wp:extent cx="0" cy="1252675"/>
-                <wp:effectExtent l="0" t="0" r="38100" b="24130"/>
-                <wp:wrapNone/>
-                <wp:docPr id="737450868" name="Gerader Verbinder 1"/>
-                <wp:cNvGraphicFramePr/>
-                <a:graphic xmlns:a="http://schemas.openxmlformats.org/drawingml/2006/main">
-                  <a:graphicData uri="http://schemas.microsoft.com/office/word/2010/wordprocessingShape">
-                    <wps:wsp>
-                      <wps:cNvCnPr/>
-                      <wps:spPr>
-                        <a:xfrm>
-                          <a:off x="0" y="0"/>
-                          <a:ext cx="0" cy="1252675"/>
-                        </a:xfrm>
-                        <a:prstGeom prst="line">
-                          <a:avLst/>
-                        </a:prstGeom>
-                      </wps:spPr>
-                      <wps:style>
-                        <a:lnRef idx="1">
-                          <a:schemeClr val="accent1"/>
-                        </a:lnRef>
-                        <a:fillRef idx="0">
-                          <a:schemeClr val="accent1"/>
-                        </a:fillRef>
-                        <a:effectRef idx="0">
-                          <a:schemeClr val="accent1"/>
-                        </a:effectRef>
-                        <a:fontRef idx="minor">
-                          <a:schemeClr val="tx1"/>
-                        </a:fontRef>
-                      </wps:style>
-                      <wps:bodyPr/>
-                    </wps:wsp>
-                  </a:graphicData>
-                </a:graphic>
-              </wp:anchor>
-            </w:drawing>
-          </mc:Choice>
-          <mc:Fallback>
-            <w:pict>
-              <v:line w14:anchorId="5F8577BA" id="Gerader Verbinder 1" o:spid="_x0000_s1026" style="position:absolute;z-index:251732992;visibility:visible;mso-wrap-style:square;mso-wrap-distance-left:9pt;mso-wrap-distance-top:0;mso-wrap-distance-right:9pt;mso-wrap-distance-bottom:0;mso-position-horizontal:absolute;mso-position-horizontal-relative:text;mso-position-vertical:absolute;mso-position-vertical-relative:text" from="442.85pt,968.4pt" to="442.85pt,1067.05pt" o:gfxdata="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" strokecolor="#4472c4 [3204]" strokeweight=".5pt">
-                <v:stroke joinstyle="miter"/>
-              </v:line>
-            </w:pict>
-          </mc:Fallback>
-        </mc:AlternateContent>
-      </w:r>
+      </w:pPr>
       <w:r>
         <w:rPr>
           <w:noProof/>
@@ -274,218 +15,15 @@
         <mc:AlternateContent>
           <mc:Choice Requires="wpg">
             <w:drawing>
-              <wp:anchor distT="0" distB="0" distL="114300" distR="114300" simplePos="0" relativeHeight="251720704" behindDoc="0" locked="0" layoutInCell="1" allowOverlap="1" wp14:anchorId="6625BA70" wp14:editId="0FE8929B">
+              <wp:anchor distT="0" distB="0" distL="114300" distR="114300" simplePos="0" relativeHeight="251663360" behindDoc="0" locked="0" layoutInCell="1" allowOverlap="1" wp14:anchorId="53A15F9A" wp14:editId="672A3A7B">
                 <wp:simplePos x="0" y="0"/>
                 <wp:positionH relativeFrom="margin">
-                  <wp:align>center</wp:align>
+                  <wp:posOffset>361950</wp:posOffset>
                 </wp:positionH>
                 <wp:positionV relativeFrom="paragraph">
-                  <wp:posOffset>10210800</wp:posOffset>
+                  <wp:posOffset>9601200</wp:posOffset>
                 </wp:positionV>
-                <wp:extent cx="4733877" cy="2306320"/>
-                <wp:effectExtent l="0" t="0" r="0" b="0"/>
-                <wp:wrapTight wrapText="bothSides">
-                  <wp:wrapPolygon edited="0">
-                    <wp:start x="4086" y="0"/>
-                    <wp:lineTo x="2695" y="178"/>
-                    <wp:lineTo x="1478" y="1784"/>
-                    <wp:lineTo x="1652" y="6780"/>
-                    <wp:lineTo x="2173" y="8564"/>
-                    <wp:lineTo x="1565" y="9456"/>
-                    <wp:lineTo x="1391" y="9991"/>
-                    <wp:lineTo x="1565" y="12311"/>
-                    <wp:lineTo x="2086" y="14273"/>
-                    <wp:lineTo x="1565" y="16236"/>
-                    <wp:lineTo x="1565" y="16414"/>
-                    <wp:lineTo x="5042" y="21410"/>
-                    <wp:lineTo x="5564" y="21410"/>
-                    <wp:lineTo x="5651" y="21410"/>
-                    <wp:lineTo x="6520" y="19982"/>
-                    <wp:lineTo x="17474" y="19982"/>
-                    <wp:lineTo x="20516" y="19447"/>
-                    <wp:lineTo x="20429" y="17128"/>
-                    <wp:lineTo x="21299" y="14273"/>
-                    <wp:lineTo x="21472" y="12132"/>
-                    <wp:lineTo x="21472" y="8385"/>
-                    <wp:lineTo x="21038" y="5709"/>
-                    <wp:lineTo x="19647" y="2855"/>
-                    <wp:lineTo x="19821" y="1606"/>
-                    <wp:lineTo x="17039" y="1070"/>
-                    <wp:lineTo x="5998" y="0"/>
-                    <wp:lineTo x="4086" y="0"/>
-                  </wp:wrapPolygon>
-                </wp:wrapTight>
-                <wp:docPr id="18947954" name="Gruppieren 5"/>
-                <wp:cNvGraphicFramePr>
-                  <a:graphicFrameLocks xmlns:a="http://schemas.openxmlformats.org/drawingml/2006/main" noChangeAspect="1"/>
-                </wp:cNvGraphicFramePr>
-                <a:graphic xmlns:a="http://schemas.openxmlformats.org/drawingml/2006/main">
-                  <a:graphicData uri="http://schemas.microsoft.com/office/word/2010/wordprocessingGroup">
-                    <wpg:wgp>
-                      <wpg:cNvGrpSpPr>
-                        <a:grpSpLocks noChangeAspect="1"/>
-                      </wpg:cNvGrpSpPr>
-                      <wpg:grpSpPr>
-                        <a:xfrm>
-                          <a:off x="0" y="0"/>
-                          <a:ext cx="4733877" cy="2306320"/>
-                          <a:chOff x="0" y="0"/>
-                          <a:chExt cx="5913490" cy="2879725"/>
-                        </a:xfrm>
-                      </wpg:grpSpPr>
-                      <pic:pic xmlns:pic="http://schemas.openxmlformats.org/drawingml/2006/picture">
-                        <pic:nvPicPr>
-                          <pic:cNvPr id="2039907498" name="Grafik 4"/>
-                          <pic:cNvPicPr>
-                            <a:picLocks noChangeAspect="1"/>
-                          </pic:cNvPicPr>
-                        </pic:nvPicPr>
-                        <pic:blipFill>
-                          <a:blip r:embed="rId6" cstate="print">
-                            <a:extLst>
-                              <a:ext uri="{28A0092B-C50C-407E-A947-70E740481C1C}">
-                                <a14:useLocalDpi xmlns:a14="http://schemas.microsoft.com/office/drawing/2010/main" val="0"/>
-                              </a:ext>
-                            </a:extLst>
-                          </a:blip>
-                          <a:stretch>
-                            <a:fillRect/>
-                          </a:stretch>
-                        </pic:blipFill>
-                        <pic:spPr>
-                          <a:xfrm>
-                            <a:off x="2152650" y="514350"/>
-                            <a:ext cx="1539240" cy="1892300"/>
-                          </a:xfrm>
-                          <a:prstGeom prst="rect">
-                            <a:avLst/>
-                          </a:prstGeom>
-                        </pic:spPr>
-                      </pic:pic>
-                      <pic:pic xmlns:pic="http://schemas.openxmlformats.org/drawingml/2006/picture">
-                        <pic:nvPicPr>
-                          <pic:cNvPr id="536651524" name="Grafik 2"/>
-                          <pic:cNvPicPr>
-                            <a:picLocks noChangeAspect="1"/>
-                          </pic:cNvPicPr>
-                        </pic:nvPicPr>
-                        <pic:blipFill>
-                          <a:blip r:embed="rId7">
-                            <a:extLst>
-                              <a:ext uri="{28A0092B-C50C-407E-A947-70E740481C1C}">
-                                <a14:useLocalDpi xmlns:a14="http://schemas.microsoft.com/office/drawing/2010/main" val="0"/>
-                              </a:ext>
-                            </a:extLst>
-                          </a:blip>
-                          <a:stretch>
-                            <a:fillRect/>
-                          </a:stretch>
-                        </pic:blipFill>
-                        <pic:spPr>
-                          <a:xfrm>
-                            <a:off x="0" y="0"/>
-                            <a:ext cx="2879725" cy="2879725"/>
-                          </a:xfrm>
-                          <a:prstGeom prst="rect">
-                            <a:avLst/>
-                          </a:prstGeom>
-                        </pic:spPr>
-                      </pic:pic>
-                      <pic:pic xmlns:pic="http://schemas.openxmlformats.org/drawingml/2006/picture">
-                        <pic:nvPicPr>
-                          <pic:cNvPr id="510488841" name="Grafik 1"/>
-                          <pic:cNvPicPr>
-                            <a:picLocks noChangeAspect="1"/>
-                          </pic:cNvPicPr>
-                        </pic:nvPicPr>
-                        <pic:blipFill>
-                          <a:blip r:embed="rId8">
-                            <a:extLst>
-                              <a:ext uri="{28A0092B-C50C-407E-A947-70E740481C1C}">
-                                <a14:useLocalDpi xmlns:a14="http://schemas.microsoft.com/office/drawing/2010/main" val="0"/>
-                              </a:ext>
-                            </a:extLst>
-                          </a:blip>
-                          <a:stretch>
-                            <a:fillRect/>
-                          </a:stretch>
-                        </pic:blipFill>
-                        <pic:spPr>
-                          <a:xfrm>
-                            <a:off x="3393809" y="171597"/>
-                            <a:ext cx="2519681" cy="2519681"/>
-                          </a:xfrm>
-                          <a:prstGeom prst="rect">
-                            <a:avLst/>
-                          </a:prstGeom>
-                        </pic:spPr>
-                      </pic:pic>
-                    </wpg:wgp>
-                  </a:graphicData>
-                </a:graphic>
-                <wp14:sizeRelH relativeFrom="margin">
-                  <wp14:pctWidth>0</wp14:pctWidth>
-                </wp14:sizeRelH>
-                <wp14:sizeRelV relativeFrom="margin">
-                  <wp14:pctHeight>0</wp14:pctHeight>
-                </wp14:sizeRelV>
-              </wp:anchor>
-            </w:drawing>
-          </mc:Choice>
-          <mc:Fallback>
-            <w:pict>
-              <v:group w14:anchorId="155DD511" id="Gruppieren 5" o:spid="_x0000_s1026" style="position:absolute;margin-left:0;margin-top:804pt;width:372.75pt;height:181.6pt;z-index:251720704;mso-position-horizontal:center;mso-position-horizontal-relative:margin;mso-width-relative:margin;mso-height-relative:margin" coordsize="59134,28797" o:gfxdata="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">
-                <o:lock v:ext="edit" aspectratio="t"/>
-                <v:shapetype id="_x0000_t75" coordsize="21600,21600" o:spt="75" o:preferrelative="t" path="m@4@5l@4@11@9@11@9@5xe" filled="f" stroked="f">
-                  <v:stroke joinstyle="miter"/>
-                  <v:formulas>
-                    <v:f eqn="if lineDrawn pixelLineWidth 0"/>
-                    <v:f eqn="sum @0 1 0"/>
-                    <v:f eqn="sum 0 0 @1"/>
-                    <v:f eqn="prod @2 1 2"/>
-                    <v:f eqn="prod @3 21600 pixelWidth"/>
-                    <v:f eqn="prod @3 21600 pixelHeight"/>
-                    <v:f eqn="sum @0 0 1"/>
-                    <v:f eqn="prod @6 1 2"/>
-                    <v:f eqn="prod @7 21600 pixelWidth"/>
-                    <v:f eqn="sum @8 21600 0"/>
-                    <v:f eqn="prod @7 21600 pixelHeight"/>
-                    <v:f eqn="sum @10 21600 0"/>
-                  </v:formulas>
-                  <v:path o:extrusionok="f" gradientshapeok="t" o:connecttype="rect"/>
-                  <o:lock v:ext="edit" aspectratio="t"/>
-                </v:shapetype>
-                <v:shape id="Grafik 4" o:spid="_x0000_s1027" type="#_x0000_t75" style="position:absolute;left:21526;top:5143;width:15392;height:18923;visibility:visible;mso-wrap-style:square" o:gfxdata="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">
-                  <v:imagedata r:id="rId9" o:title=""/>
-                </v:shape>
-                <v:shape id="Grafik 2" o:spid="_x0000_s1028" type="#_x0000_t75" style="position:absolute;width:28797;height:28797;visibility:visible;mso-wrap-style:square" o:gfxdata="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">
-                  <v:imagedata r:id="rId10" o:title=""/>
-                </v:shape>
-                <v:shape id="Grafik 1" o:spid="_x0000_s1029" type="#_x0000_t75" style="position:absolute;left:33938;top:1715;width:25196;height:25197;visibility:visible;mso-wrap-style:square" o:gfxdata="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">
-                  <v:imagedata r:id="rId11" o:title=""/>
-                </v:shape>
-                <w10:wrap type="tight" anchorx="margin"/>
-              </v:group>
-            </w:pict>
-          </mc:Fallback>
-        </mc:AlternateContent>
-      </w:r>
-      <w:r>
-        <w:rPr>
-          <w:noProof/>
-        </w:rPr>
-        <mc:AlternateContent>
-          <mc:Choice Requires="wpg">
-            <w:drawing>
-              <wp:anchor distT="0" distB="0" distL="114300" distR="114300" simplePos="0" relativeHeight="251727872" behindDoc="0" locked="0" layoutInCell="1" allowOverlap="1" wp14:anchorId="53A15F9A" wp14:editId="0D85A70D">
-                <wp:simplePos x="0" y="0"/>
-                <wp:positionH relativeFrom="margin">
-                  <wp:align>center</wp:align>
-                </wp:positionH>
-                <wp:positionV relativeFrom="paragraph">
-                  <wp:posOffset>12626975</wp:posOffset>
-                </wp:positionV>
-                <wp:extent cx="6038193" cy="1765738"/>
+                <wp:extent cx="7467600" cy="1765716"/>
                 <wp:effectExtent l="0" t="0" r="0" b="6350"/>
                 <wp:wrapSquare wrapText="bothSides"/>
                 <wp:docPr id="310167667" name="Gruppieren 1"/>
@@ -497,9 +35,9 @@
                       <wpg:grpSpPr>
                         <a:xfrm>
                           <a:off x="0" y="0"/>
-                          <a:ext cx="6038193" cy="1765738"/>
-                          <a:chOff x="0" y="0"/>
-                          <a:chExt cx="7283560" cy="1765738"/>
+                          <a:ext cx="7467600" cy="1765716"/>
+                          <a:chOff x="-170325" y="-47286"/>
+                          <a:chExt cx="7490813" cy="1765738"/>
                         </a:xfrm>
                       </wpg:grpSpPr>
                       <wps:wsp>
@@ -509,119 +47,8 @@
                         </wps:cNvSpPr>
                         <wps:spPr bwMode="auto">
                           <a:xfrm>
-                            <a:off x="0" y="0"/>
-                            <a:ext cx="3641725" cy="1765738"/>
-                          </a:xfrm>
-                          <a:prstGeom prst="rect">
-                            <a:avLst/>
-                          </a:prstGeom>
-                          <a:noFill/>
-                          <a:ln w="9525">
-                            <a:noFill/>
-                            <a:miter lim="800000"/>
-                            <a:headEnd/>
-                            <a:tailEnd/>
-                          </a:ln>
-                        </wps:spPr>
-                        <wps:txbx>
-                          <w:txbxContent>
-                            <w:p>
-                              <w:pPr>
-                                <w:spacing w:after="0"/>
-                                <w:jc w:val="center"/>
-                                <w:rPr>
-                                  <w:b/>
-                                  <w:bCs/>
-                                  <w:color w:val="FFFFFF" w:themeColor="background1"/>
-                                  <w:sz w:val="44"/>
-                                  <w:szCs w:val="44"/>
-                                </w:rPr>
-                              </w:pPr>
-                              <w:r>
-                                <w:rPr>
-                                  <w:b/>
-                                  <w:bCs/>
-                                  <w:color w:val="FFFFFF" w:themeColor="background1"/>
-                                  <w:sz w:val="44"/>
-                                  <w:szCs w:val="44"/>
-                                </w:rPr>
-                                <w:t>FC Fortuna 91 Plauen</w:t>
-                              </w:r>
-                            </w:p>
-                            <w:p>
-                              <w:pPr>
-                                <w:spacing w:after="0"/>
-                                <w:jc w:val="center"/>
-                                <w:rPr>
-                                  <w:b/>
-                                  <w:bCs/>
-                                  <w:color w:val="FFFFFF" w:themeColor="background1"/>
-                                  <w:sz w:val="44"/>
-                                  <w:szCs w:val="44"/>
-                                </w:rPr>
-                              </w:pPr>
-                              <w:r>
-                                <w:rPr>
-                                  <w:b/>
-                                  <w:bCs/>
-                                  <w:color w:val="FFFFFF" w:themeColor="background1"/>
-                                  <w:sz w:val="44"/>
-                                  <w:szCs w:val="44"/>
-                                </w:rPr>
-                                <w:t>Platz 10 (3 / 5:8)</w:t>
-                              </w:r>
-                            </w:p>
-                            <w:p>
-                              <w:pPr>
-                                <w:spacing w:after="0"/>
-                                <w:jc w:val="center"/>
-                                <w:rPr>
-                                  <w:b/>
-                                  <w:bCs/>
-                                  <w:color w:val="FFFFFF" w:themeColor="background1"/>
-                                  <w:sz w:val="44"/>
-                                  <w:szCs w:val="44"/>
-                                </w:rPr>
-                              </w:pPr>
-                              <w:r>
-                                <w:rPr>
-                                  <w:b/>
-                                  <w:bCs/>
-                                  <w:color w:val="FFFFFF" w:themeColor="background1"/>
-                                  <w:sz w:val="44"/>
-                                  <w:szCs w:val="44"/>
-                                </w:rPr>
-                                <w:t>Trend: N|S|N</w:t>
-                              </w:r>
-                            </w:p>
-                            <w:p>
-                              <w:pPr>
-                                <w:spacing w:after="0"/>
-                                <w:jc w:val="center"/>
-                                <w:rPr>
-                                  <w:b/>
-                                  <w:bCs/>
-                                  <w:color w:val="FFFFFF" w:themeColor="background1"/>
-                                  <w:sz w:val="44"/>
-                                  <w:szCs w:val="44"/>
-                                </w:rPr>
-                              </w:pPr>
-                            </w:p>
-                          </w:txbxContent>
-                        </wps:txbx>
-                        <wps:bodyPr rot="0" vert="horz" wrap="square" lIns="91440" tIns="45720" rIns="91440" bIns="45720" anchor="t" anchorCtr="0">
-                          <a:noAutofit/>
-                        </wps:bodyPr>
-                      </wps:wsp>
-                      <wps:wsp>
-                        <wps:cNvPr id="2214818" name="Textfeld 2"/>
-                        <wps:cNvSpPr txBox="1">
-                          <a:spLocks noChangeArrowheads="1"/>
-                        </wps:cNvSpPr>
-                        <wps:spPr bwMode="auto">
-                          <a:xfrm>
-                            <a:off x="3641835" y="0"/>
-                            <a:ext cx="3641725" cy="1718441"/>
+                            <a:off x="-170325" y="-47286"/>
+                            <a:ext cx="4032045" cy="1765738"/>
                           </a:xfrm>
                           <a:prstGeom prst="rect">
                             <a:avLst/>
@@ -679,7 +106,67 @@
                                   <w:sz w:val="44"/>
                                   <w:szCs w:val="44"/>
                                 </w:rPr>
-                                <w:t>Platz 2 (9 / 13:5)</w:t>
+                                <w:t>Platz 1 (</w:t>
+                              </w:r>
+                              <w:r>
+                                <w:rPr>
+                                  <w:b/>
+                                  <w:bCs/>
+                                  <w:color w:val="FFFFFF" w:themeColor="background1"/>
+                                  <w:sz w:val="44"/>
+                                  <w:szCs w:val="44"/>
+                                </w:rPr>
+                                <w:t>0</w:t>
+                              </w:r>
+                              <w:r>
+                                <w:rPr>
+                                  <w:b/>
+                                  <w:bCs/>
+                                  <w:color w:val="FFFFFF" w:themeColor="background1"/>
+                                  <w:sz w:val="44"/>
+                                  <w:szCs w:val="44"/>
+                                </w:rPr>
+                                <w:t xml:space="preserve"> / </w:t>
+                              </w:r>
+                              <w:r>
+                                <w:rPr>
+                                  <w:b/>
+                                  <w:bCs/>
+                                  <w:color w:val="FFFFFF" w:themeColor="background1"/>
+                                  <w:sz w:val="44"/>
+                                  <w:szCs w:val="44"/>
+                                </w:rPr>
+                                <w:t>0</w:t>
+                              </w:r>
+                              <w:r>
+                                <w:rPr>
+                                  <w:b/>
+                                  <w:bCs/>
+                                  <w:color w:val="FFFFFF" w:themeColor="background1"/>
+                                  <w:sz w:val="44"/>
+                                  <w:szCs w:val="44"/>
+                                </w:rPr>
+                                <w:t>:</w:t>
+                              </w:r>
+                              <w:r>
+                                <w:rPr>
+                                  <w:b/>
+                                  <w:bCs/>
+                                  <w:color w:val="FFFFFF" w:themeColor="background1"/>
+                                  <w:sz w:val="44"/>
+                                  <w:szCs w:val="44"/>
+                                </w:rPr>
+                                <w:t>0</w:t>
+                              </w:r>
+                              <w:r>
+                                <w:rPr>
+                                  <w:b/>
+                                  <w:bCs/>
+                                  <w:color w:val="FFFFFF" w:themeColor="background1"/>
+                                  <w:sz w:val="44"/>
+                                  <w:szCs w:val="44"/>
+                                </w:rPr>
+                                <w:t>)</w:t>
                               </w:r>
                             </w:p>
                             <w:p>
@@ -702,7 +189,230 @@
                                   <w:sz w:val="44"/>
                                   <w:szCs w:val="44"/>
                                 </w:rPr>
-                                <w:t>Trend: N|S|S|S</w:t>
+                                <w:t xml:space="preserve">Trend: </w:t>
+                              </w:r>
+                              <w:r>
+                                <w:rPr>
+                                  <w:b/>
+                                  <w:bCs/>
+                                  <w:color w:val="FFFFFF" w:themeColor="background1"/>
+                                  <w:sz w:val="44"/>
+                                  <w:szCs w:val="44"/>
+                                </w:rPr>
+                                <w:t>-</w:t>
+                              </w:r>
+                            </w:p>
+                            <w:p>
+                              <w:pPr>
+                                <w:spacing w:after="0"/>
+                                <w:jc w:val="center"/>
+                                <w:rPr>
+                                  <w:b/>
+                                  <w:bCs/>
+                                  <w:color w:val="FFFFFF" w:themeColor="background1"/>
+                                  <w:sz w:val="44"/>
+                                  <w:szCs w:val="44"/>
+                                </w:rPr>
+                              </w:pPr>
+                            </w:p>
+                          </w:txbxContent>
+                        </wps:txbx>
+                        <wps:bodyPr rot="0" vert="horz" wrap="square" lIns="91440" tIns="45720" rIns="91440" bIns="45720" anchor="t" anchorCtr="0">
+                          <a:noAutofit/>
+                        </wps:bodyPr>
+                      </wps:wsp>
+                      <wps:wsp>
+                        <wps:cNvPr id="2214818" name="Textfeld 2"/>
+                        <wps:cNvSpPr txBox="1">
+                          <a:spLocks noChangeArrowheads="1"/>
+                        </wps:cNvSpPr>
+                        <wps:spPr bwMode="auto">
+                          <a:xfrm>
+                            <a:off x="3517754" y="-12690"/>
+                            <a:ext cx="3802734" cy="1718441"/>
+                          </a:xfrm>
+                          <a:prstGeom prst="rect">
+                            <a:avLst/>
+                          </a:prstGeom>
+                          <a:noFill/>
+                          <a:ln w="9525">
+                            <a:noFill/>
+                            <a:miter lim="800000"/>
+                            <a:headEnd/>
+                            <a:tailEnd/>
+                          </a:ln>
+                        </wps:spPr>
+                        <wps:txbx>
+                          <w:txbxContent>
+                            <w:p>
+                              <w:pPr>
+                                <w:spacing w:after="0"/>
+                                <w:jc w:val="center"/>
+                                <w:rPr>
+                                  <w:b/>
+                                  <w:bCs/>
+                                  <w:color w:val="FFFFFF" w:themeColor="background1"/>
+                                  <w:sz w:val="44"/>
+                                  <w:szCs w:val="44"/>
+                                </w:rPr>
+                              </w:pPr>
+                              <w:proofErr w:type="gramStart"/>
+                              <w:r>
+                                <w:rPr>
+                                  <w:b/>
+                                  <w:bCs/>
+                                  <w:color w:val="FFFFFF" w:themeColor="background1"/>
+                                  <w:sz w:val="44"/>
+                                  <w:szCs w:val="44"/>
+                                </w:rPr>
+                                <w:t>SSV Fortschritt</w:t>
+                              </w:r>
+                              <w:proofErr w:type="gramEnd"/>
+                              <w:r>
+                                <w:rPr>
+                                  <w:b/>
+                                  <w:bCs/>
+                                  <w:color w:val="FFFFFF" w:themeColor="background1"/>
+                                  <w:sz w:val="44"/>
+                                  <w:szCs w:val="44"/>
+                                </w:rPr>
+                                <w:t xml:space="preserve"> Lichtenstein</w:t>
+                              </w:r>
+                            </w:p>
+                            <w:p>
+                              <w:pPr>
+                                <w:spacing w:after="0"/>
+                                <w:jc w:val="center"/>
+                                <w:rPr>
+                                  <w:b/>
+                                  <w:bCs/>
+                                  <w:color w:val="FFFFFF" w:themeColor="background1"/>
+                                  <w:sz w:val="44"/>
+                                  <w:szCs w:val="44"/>
+                                </w:rPr>
+                              </w:pPr>
+                              <w:r>
+                                <w:rPr>
+                                  <w:b/>
+                                  <w:bCs/>
+                                  <w:color w:val="FFFFFF" w:themeColor="background1"/>
+                                  <w:sz w:val="44"/>
+                                  <w:szCs w:val="44"/>
+                                </w:rPr>
+                                <w:t xml:space="preserve">Platz </w:t>
+                              </w:r>
+                              <w:r>
+                                <w:rPr>
+                                  <w:b/>
+                                  <w:bCs/>
+                                  <w:color w:val="FFFFFF" w:themeColor="background1"/>
+                                  <w:sz w:val="44"/>
+                                  <w:szCs w:val="44"/>
+                                </w:rPr>
+                                <w:t>1</w:t>
+                              </w:r>
+                              <w:r>
+                                <w:rPr>
+                                  <w:b/>
+                                  <w:bCs/>
+                                  <w:color w:val="FFFFFF" w:themeColor="background1"/>
+                                  <w:sz w:val="44"/>
+                                  <w:szCs w:val="44"/>
+                                </w:rPr>
+                                <w:t xml:space="preserve"> (</w:t>
+                              </w:r>
+                              <w:r>
+                                <w:rPr>
+                                  <w:b/>
+                                  <w:bCs/>
+                                  <w:color w:val="FFFFFF" w:themeColor="background1"/>
+                                  <w:sz w:val="44"/>
+                                  <w:szCs w:val="44"/>
+                                </w:rPr>
+                                <w:t>0</w:t>
+                              </w:r>
+                              <w:r>
+                                <w:rPr>
+                                  <w:b/>
+                                  <w:bCs/>
+                                  <w:color w:val="FFFFFF" w:themeColor="background1"/>
+                                  <w:sz w:val="44"/>
+                                  <w:szCs w:val="44"/>
+                                </w:rPr>
+                                <w:t xml:space="preserve"> / </w:t>
+                              </w:r>
+                              <w:r>
+                                <w:rPr>
+                                  <w:b/>
+                                  <w:bCs/>
+                                  <w:color w:val="FFFFFF" w:themeColor="background1"/>
+                                  <w:sz w:val="44"/>
+                                  <w:szCs w:val="44"/>
+                                </w:rPr>
+                                <w:t>0</w:t>
+                              </w:r>
+                              <w:r>
+                                <w:rPr>
+                                  <w:b/>
+                                  <w:bCs/>
+                                  <w:color w:val="FFFFFF" w:themeColor="background1"/>
+                                  <w:sz w:val="44"/>
+                                  <w:szCs w:val="44"/>
+                                </w:rPr>
+                                <w:t>:</w:t>
+                              </w:r>
+                              <w:r>
+                                <w:rPr>
+                                  <w:b/>
+                                  <w:bCs/>
+                                  <w:color w:val="FFFFFF" w:themeColor="background1"/>
+                                  <w:sz w:val="44"/>
+                                  <w:szCs w:val="44"/>
+                                </w:rPr>
+                                <w:t>0</w:t>
+                              </w:r>
+                              <w:r>
+                                <w:rPr>
+                                  <w:b/>
+                                  <w:bCs/>
+                                  <w:color w:val="FFFFFF" w:themeColor="background1"/>
+                                  <w:sz w:val="44"/>
+                                  <w:szCs w:val="44"/>
+                                </w:rPr>
+                                <w:t>)</w:t>
+                              </w:r>
+                            </w:p>
+                            <w:p>
+                              <w:pPr>
+                                <w:spacing w:after="0"/>
+                                <w:jc w:val="center"/>
+                                <w:rPr>
+                                  <w:b/>
+                                  <w:bCs/>
+                                  <w:color w:val="FFFFFF" w:themeColor="background1"/>
+                                  <w:sz w:val="44"/>
+                                  <w:szCs w:val="44"/>
+                                </w:rPr>
+                              </w:pPr>
+                              <w:r>
+                                <w:rPr>
+                                  <w:b/>
+                                  <w:bCs/>
+                                  <w:color w:val="FFFFFF" w:themeColor="background1"/>
+                                  <w:sz w:val="44"/>
+                                  <w:szCs w:val="44"/>
+                                </w:rPr>
+                                <w:t xml:space="preserve">Trend: </w:t>
+                              </w:r>
+                              <w:r>
+                                <w:rPr>
+                                  <w:b/>
+                                  <w:bCs/>
+                                  <w:color w:val="FFFFFF" w:themeColor="background1"/>
+                                  <w:sz w:val="44"/>
+                                  <w:szCs w:val="44"/>
+                                </w:rPr>
+                                <w:t>-</w:t>
                               </w:r>
                             </w:p>
                             <w:p>
@@ -730,105 +440,20 @@
                 <wp14:sizeRelH relativeFrom="margin">
                   <wp14:pctWidth>0</wp14:pctWidth>
                 </wp14:sizeRelH>
+                <wp14:sizeRelV relativeFrom="margin">
+                  <wp14:pctHeight>0</wp14:pctHeight>
+                </wp14:sizeRelV>
               </wp:anchor>
             </w:drawing>
           </mc:Choice>
           <mc:Fallback>
             <w:pict>
-              <v:group w14:anchorId="53A15F9A" id="Gruppieren 1" o:spid="_x0000_s1026" style="position:absolute;left:0;text-align:left;margin-left:0;margin-top:994.25pt;width:475.45pt;height:139.05pt;z-index:251727872;mso-position-horizontal:center;mso-position-horizontal-relative:margin;mso-width-relative:margin" coordsize="72835,17657" o:gfxdata="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">
+              <v:group w14:anchorId="53A15F9A" id="Gruppieren 1" o:spid="_x0000_s1026" style="position:absolute;margin-left:28.5pt;margin-top:756pt;width:588pt;height:139.05pt;z-index:251663360;mso-position-horizontal-relative:margin;mso-width-relative:margin;mso-height-relative:margin" coordorigin="-1703,-472" coordsize="74908,17657" o:gfxdata="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">
                 <v:shapetype id="_x0000_t202" coordsize="21600,21600" o:spt="202" path="m,l,21600r21600,l21600,xe">
                   <v:stroke joinstyle="miter"/>
                   <v:path gradientshapeok="t" o:connecttype="rect"/>
                 </v:shapetype>
-                <v:shape id="_x0000_s1027" type="#_x0000_t202" style="position:absolute;width:36417;height:17657;visibility:visible;mso-wrap-style:square;v-text-anchor:top" o:gfxdata="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" filled="f" stroked="f">
-                  <v:textbox>
-                    <w:txbxContent>
-                      <w:p>
-                        <w:pPr>
-                          <w:spacing w:after="0"/>
-                          <w:jc w:val="center"/>
-                          <w:rPr>
-                            <w:b/>
-                            <w:bCs/>
-                            <w:color w:val="FFFFFF" w:themeColor="background1"/>
-                            <w:sz w:val="44"/>
-                            <w:szCs w:val="44"/>
-                          </w:rPr>
-                        </w:pPr>
-                        <w:r>
-                          <w:rPr>
-                            <w:b/>
-                            <w:bCs/>
-                            <w:color w:val="FFFFFF" w:themeColor="background1"/>
-                            <w:sz w:val="44"/>
-                            <w:szCs w:val="44"/>
-                          </w:rPr>
-                          <w:t>FC Fortuna 91 Plauen</w:t>
-                        </w:r>
-                      </w:p>
-                      <w:p>
-                        <w:pPr>
-                          <w:spacing w:after="0"/>
-                          <w:jc w:val="center"/>
-                          <w:rPr>
-                            <w:b/>
-                            <w:bCs/>
-                            <w:color w:val="FFFFFF" w:themeColor="background1"/>
-                            <w:sz w:val="44"/>
-                            <w:szCs w:val="44"/>
-                          </w:rPr>
-                        </w:pPr>
-                        <w:r>
-                          <w:rPr>
-                            <w:b/>
-                            <w:bCs/>
-                            <w:color w:val="FFFFFF" w:themeColor="background1"/>
-                            <w:sz w:val="44"/>
-                            <w:szCs w:val="44"/>
-                          </w:rPr>
-                          <w:t>Platz 10 (3 / 5:8)</w:t>
-                        </w:r>
-                      </w:p>
-                      <w:p>
-                        <w:pPr>
-                          <w:spacing w:after="0"/>
-                          <w:jc w:val="center"/>
-                          <w:rPr>
-                            <w:b/>
-                            <w:bCs/>
-                            <w:color w:val="FFFFFF" w:themeColor="background1"/>
-                            <w:sz w:val="44"/>
-                            <w:szCs w:val="44"/>
-                          </w:rPr>
-                        </w:pPr>
-                        <w:r>
-                          <w:rPr>
-                            <w:b/>
-                            <w:bCs/>
-                            <w:color w:val="FFFFFF" w:themeColor="background1"/>
-                            <w:sz w:val="44"/>
-                            <w:szCs w:val="44"/>
-                          </w:rPr>
-                          <w:t>Trend: N|S|N</w:t>
-                        </w:r>
-                      </w:p>
-                      <w:p>
-                        <w:pPr>
-                          <w:spacing w:after="0"/>
-                          <w:jc w:val="center"/>
-                          <w:rPr>
-                            <w:b/>
-                            <w:bCs/>
-                            <w:color w:val="FFFFFF" w:themeColor="background1"/>
-                            <w:sz w:val="44"/>
-                            <w:szCs w:val="44"/>
-                          </w:rPr>
-                        </w:pPr>
-                      </w:p>
-                    </w:txbxContent>
-                  </v:textbox>
-                </v:shape>
-                <v:shape id="_x0000_s1028" type="#_x0000_t202" style="position:absolute;left:36418;width:36417;height:17184;visibility:visible;mso-wrap-style:square;v-text-anchor:top" o:gfxdata="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" filled="f" stroked="f">
+                <v:shape id="_x0000_s1027" type="#_x0000_t202" style="position:absolute;left:-1703;top:-472;width:40320;height:17656;visibility:visible;mso-wrap-style:square;v-text-anchor:top" o:gfxdata="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" filled="f" stroked="f">
                   <v:textbox>
                     <w:txbxContent>
                       <w:p>
@@ -874,7 +499,67 @@
                             <w:sz w:val="44"/>
                             <w:szCs w:val="44"/>
                           </w:rPr>
-                          <w:t>Platz 2 (9 / 13:5)</w:t>
+                          <w:t>Platz 1 (</w:t>
+                        </w:r>
+                        <w:r>
+                          <w:rPr>
+                            <w:b/>
+                            <w:bCs/>
+                            <w:color w:val="FFFFFF" w:themeColor="background1"/>
+                            <w:sz w:val="44"/>
+                            <w:szCs w:val="44"/>
+                          </w:rPr>
+                          <w:t>0</w:t>
+                        </w:r>
+                        <w:r>
+                          <w:rPr>
+                            <w:b/>
+                            <w:bCs/>
+                            <w:color w:val="FFFFFF" w:themeColor="background1"/>
+                            <w:sz w:val="44"/>
+                            <w:szCs w:val="44"/>
+                          </w:rPr>
+                          <w:t xml:space="preserve"> / </w:t>
+                        </w:r>
+                        <w:r>
+                          <w:rPr>
+                            <w:b/>
+                            <w:bCs/>
+                            <w:color w:val="FFFFFF" w:themeColor="background1"/>
+                            <w:sz w:val="44"/>
+                            <w:szCs w:val="44"/>
+                          </w:rPr>
+                          <w:t>0</w:t>
+                        </w:r>
+                        <w:r>
+                          <w:rPr>
+                            <w:b/>
+                            <w:bCs/>
+                            <w:color w:val="FFFFFF" w:themeColor="background1"/>
+                            <w:sz w:val="44"/>
+                            <w:szCs w:val="44"/>
+                          </w:rPr>
+                          <w:t>:</w:t>
+                        </w:r>
+                        <w:r>
+                          <w:rPr>
+                            <w:b/>
+                            <w:bCs/>
+                            <w:color w:val="FFFFFF" w:themeColor="background1"/>
+                            <w:sz w:val="44"/>
+                            <w:szCs w:val="44"/>
+                          </w:rPr>
+                          <w:t>0</w:t>
+                        </w:r>
+                        <w:r>
+                          <w:rPr>
+                            <w:b/>
+                            <w:bCs/>
+                            <w:color w:val="FFFFFF" w:themeColor="background1"/>
+                            <w:sz w:val="44"/>
+                            <w:szCs w:val="44"/>
+                          </w:rPr>
+                          <w:t>)</w:t>
                         </w:r>
                       </w:p>
                       <w:p>
@@ -897,7 +582,207 @@
                             <w:sz w:val="44"/>
                             <w:szCs w:val="44"/>
                           </w:rPr>
-                          <w:t>Trend: N|S|S|S</w:t>
+                          <w:t xml:space="preserve">Trend: </w:t>
+                        </w:r>
+                        <w:r>
+                          <w:rPr>
+                            <w:b/>
+                            <w:bCs/>
+                            <w:color w:val="FFFFFF" w:themeColor="background1"/>
+                            <w:sz w:val="44"/>
+                            <w:szCs w:val="44"/>
+                          </w:rPr>
+                          <w:t>-</w:t>
+                        </w:r>
+                      </w:p>
+                      <w:p>
+                        <w:pPr>
+                          <w:spacing w:after="0"/>
+                          <w:jc w:val="center"/>
+                          <w:rPr>
+                            <w:b/>
+                            <w:bCs/>
+                            <w:color w:val="FFFFFF" w:themeColor="background1"/>
+                            <w:sz w:val="44"/>
+                            <w:szCs w:val="44"/>
+                          </w:rPr>
+                        </w:pPr>
+                      </w:p>
+                    </w:txbxContent>
+                  </v:textbox>
+                </v:shape>
+                <v:shape id="_x0000_s1028" type="#_x0000_t202" style="position:absolute;left:35177;top:-126;width:38027;height:17183;visibility:visible;mso-wrap-style:square;v-text-anchor:top" o:gfxdata="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" filled="f" stroked="f">
+                  <v:textbox>
+                    <w:txbxContent>
+                      <w:p>
+                        <w:pPr>
+                          <w:spacing w:after="0"/>
+                          <w:jc w:val="center"/>
+                          <w:rPr>
+                            <w:b/>
+                            <w:bCs/>
+                            <w:color w:val="FFFFFF" w:themeColor="background1"/>
+                            <w:sz w:val="44"/>
+                            <w:szCs w:val="44"/>
+                          </w:rPr>
+                        </w:pPr>
+                        <w:proofErr w:type="gramStart"/>
+                        <w:r>
+                          <w:rPr>
+                            <w:b/>
+                            <w:bCs/>
+                            <w:color w:val="FFFFFF" w:themeColor="background1"/>
+                            <w:sz w:val="44"/>
+                            <w:szCs w:val="44"/>
+                          </w:rPr>
+                          <w:t>SSV Fortschritt</w:t>
+                        </w:r>
+                        <w:proofErr w:type="gramEnd"/>
+                        <w:r>
+                          <w:rPr>
+                            <w:b/>
+                            <w:bCs/>
+                            <w:color w:val="FFFFFF" w:themeColor="background1"/>
+                            <w:sz w:val="44"/>
+                            <w:szCs w:val="44"/>
+                          </w:rPr>
+                          <w:t xml:space="preserve"> Lichtenstein</w:t>
+                        </w:r>
+                      </w:p>
+                      <w:p>
+                        <w:pPr>
+                          <w:spacing w:after="0"/>
+                          <w:jc w:val="center"/>
+                          <w:rPr>
+                            <w:b/>
+                            <w:bCs/>
+                            <w:color w:val="FFFFFF" w:themeColor="background1"/>
+                            <w:sz w:val="44"/>
+                            <w:szCs w:val="44"/>
+                          </w:rPr>
+                        </w:pPr>
+                        <w:r>
+                          <w:rPr>
+                            <w:b/>
+                            <w:bCs/>
+                            <w:color w:val="FFFFFF" w:themeColor="background1"/>
+                            <w:sz w:val="44"/>
+                            <w:szCs w:val="44"/>
+                          </w:rPr>
+                          <w:t xml:space="preserve">Platz </w:t>
+                        </w:r>
+                        <w:r>
+                          <w:rPr>
+                            <w:b/>
+                            <w:bCs/>
+                            <w:color w:val="FFFFFF" w:themeColor="background1"/>
+                            <w:sz w:val="44"/>
+                            <w:szCs w:val="44"/>
+                          </w:rPr>
+                          <w:t>1</w:t>
+                        </w:r>
+                        <w:r>
+                          <w:rPr>
+                            <w:b/>
+                            <w:bCs/>
+                            <w:color w:val="FFFFFF" w:themeColor="background1"/>
+                            <w:sz w:val="44"/>
+                            <w:szCs w:val="44"/>
+                          </w:rPr>
+                          <w:t xml:space="preserve"> (</w:t>
+                        </w:r>
+                        <w:r>
+                          <w:rPr>
+                            <w:b/>
+                            <w:bCs/>
+                            <w:color w:val="FFFFFF" w:themeColor="background1"/>
+                            <w:sz w:val="44"/>
+                            <w:szCs w:val="44"/>
+                          </w:rPr>
+                          <w:t>0</w:t>
+                        </w:r>
+                        <w:r>
+                          <w:rPr>
+                            <w:b/>
+                            <w:bCs/>
+                            <w:color w:val="FFFFFF" w:themeColor="background1"/>
+                            <w:sz w:val="44"/>
+                            <w:szCs w:val="44"/>
+                          </w:rPr>
+                          <w:t xml:space="preserve"> / </w:t>
+                        </w:r>
+                        <w:r>
+                          <w:rPr>
+                            <w:b/>
+                            <w:bCs/>
+                            <w:color w:val="FFFFFF" w:themeColor="background1"/>
+                            <w:sz w:val="44"/>
+                            <w:szCs w:val="44"/>
+                          </w:rPr>
+                          <w:t>0</w:t>
+                        </w:r>
+                        <w:r>
+                          <w:rPr>
+                            <w:b/>
+                            <w:bCs/>
+                            <w:color w:val="FFFFFF" w:themeColor="background1"/>
+                            <w:sz w:val="44"/>
+                            <w:szCs w:val="44"/>
+                          </w:rPr>
+                          <w:t>:</w:t>
+                        </w:r>
+                        <w:r>
+                          <w:rPr>
+                            <w:b/>
+                            <w:bCs/>
+                            <w:color w:val="FFFFFF" w:themeColor="background1"/>
+                            <w:sz w:val="44"/>
+                            <w:szCs w:val="44"/>
+                          </w:rPr>
+                          <w:t>0</w:t>
+                        </w:r>
+                        <w:r>
+                          <w:rPr>
+                            <w:b/>
+                            <w:bCs/>
+                            <w:color w:val="FFFFFF" w:themeColor="background1"/>
+                            <w:sz w:val="44"/>
+                            <w:szCs w:val="44"/>
+                          </w:rPr>
+                          <w:t>)</w:t>
+                        </w:r>
+                      </w:p>
+                      <w:p>
+                        <w:pPr>
+                          <w:spacing w:after="0"/>
+                          <w:jc w:val="center"/>
+                          <w:rPr>
+                            <w:b/>
+                            <w:bCs/>
+                            <w:color w:val="FFFFFF" w:themeColor="background1"/>
+                            <w:sz w:val="44"/>
+                            <w:szCs w:val="44"/>
+                          </w:rPr>
+                        </w:pPr>
+                        <w:r>
+                          <w:rPr>
+                            <w:b/>
+                            <w:bCs/>
+                            <w:color w:val="FFFFFF" w:themeColor="background1"/>
+                            <w:sz w:val="44"/>
+                            <w:szCs w:val="44"/>
+                          </w:rPr>
+                          <w:t xml:space="preserve">Trend: </w:t>
+                        </w:r>
+                        <w:r>
+                          <w:rPr>
+                            <w:b/>
+                            <w:bCs/>
+                            <w:color w:val="FFFFFF" w:themeColor="background1"/>
+                            <w:sz w:val="44"/>
+                            <w:szCs w:val="44"/>
+                          </w:rPr>
+                          <w:t>-</w:t>
                         </w:r>
                       </w:p>
                       <w:p>
@@ -926,191 +811,37 @@
         <w:rPr>
           <w:noProof/>
         </w:rPr>
-        <mc:AlternateContent>
-          <mc:Choice Requires="wps">
-            <w:drawing>
-              <wp:anchor distT="0" distB="0" distL="114300" distR="114300" simplePos="0" relativeHeight="251729920" behindDoc="0" locked="0" layoutInCell="1" allowOverlap="1" wp14:anchorId="262A1B8D" wp14:editId="25289E73">
-                <wp:simplePos x="0" y="0"/>
-                <wp:positionH relativeFrom="column">
-                  <wp:posOffset>4907915</wp:posOffset>
-                </wp:positionH>
-                <wp:positionV relativeFrom="paragraph">
-                  <wp:posOffset>3695065</wp:posOffset>
-                </wp:positionV>
-                <wp:extent cx="2286000" cy="2286000"/>
-                <wp:effectExtent l="0" t="0" r="0" b="0"/>
-                <wp:wrapNone/>
-                <wp:docPr id="1865882675" name="Ellipse 4"/>
-                <wp:cNvGraphicFramePr/>
-                <a:graphic xmlns:a="http://schemas.openxmlformats.org/drawingml/2006/main">
-                  <a:graphicData uri="http://schemas.microsoft.com/office/word/2010/wordprocessingShape">
-                    <wps:wsp>
-                      <wps:cNvSpPr/>
-                      <wps:spPr>
-                        <a:xfrm>
-                          <a:off x="0" y="0"/>
-                          <a:ext cx="2286000" cy="2286000"/>
-                        </a:xfrm>
-                        <a:prstGeom prst="ellipse">
-                          <a:avLst/>
-                        </a:prstGeom>
-                        <a:solidFill>
-                          <a:srgbClr val="FF0020"/>
-                        </a:solidFill>
-                        <a:ln>
-                          <a:noFill/>
-                        </a:ln>
-                      </wps:spPr>
-                      <wps:style>
-                        <a:lnRef idx="2">
-                          <a:schemeClr val="accent1">
-                            <a:shade val="15000"/>
-                          </a:schemeClr>
-                        </a:lnRef>
-                        <a:fillRef idx="1">
-                          <a:schemeClr val="accent1"/>
-                        </a:fillRef>
-                        <a:effectRef idx="0">
-                          <a:schemeClr val="accent1"/>
-                        </a:effectRef>
-                        <a:fontRef idx="minor">
-                          <a:schemeClr val="lt1"/>
-                        </a:fontRef>
-                      </wps:style>
-                      <wps:txbx>
-                        <w:txbxContent>
-                          <w:p>
-                            <w:pPr>
-                              <w:spacing w:after="0"/>
-                              <w:jc w:val="center"/>
-                              <w:rPr>
-                                <w:b/>
-                                <w:bCs/>
-                                <w:sz w:val="48"/>
-                                <w:szCs w:val="48"/>
-                              </w:rPr>
-                            </w:pPr>
-                            <w:r>
-                              <w:rPr>
-                                <w:b/>
-                                <w:bCs/>
-                                <w:sz w:val="48"/>
-                                <w:szCs w:val="48"/>
-                              </w:rPr>
-                              <w:t>13.09.2025</w:t>
-                            </w:r>
-                          </w:p>
-                          <w:p>
-                            <w:pPr>
-                              <w:jc w:val="center"/>
-                              <w:rPr>
-                                <w:b/>
-                                <w:bCs/>
-                                <w:sz w:val="48"/>
-                                <w:szCs w:val="48"/>
-                              </w:rPr>
-                            </w:pPr>
-                            <w:r>
-                              <w:rPr>
-                                <w:b/>
-                                <w:bCs/>
-                                <w:sz w:val="48"/>
-                                <w:szCs w:val="48"/>
-                              </w:rPr>
-                              <w:t>15:00 Uhr</w:t>
-                            </w:r>
-                          </w:p>
-                        </w:txbxContent>
-                      </wps:txbx>
-                      <wps:bodyPr rot="0" spcFirstLastPara="0" vertOverflow="overflow" horzOverflow="overflow" vert="horz" wrap="square" lIns="91440" tIns="45720" rIns="91440" bIns="45720" numCol="1" spcCol="0" rtlCol="0" fromWordArt="0" anchor="ctr" anchorCtr="0" forceAA="0" compatLnSpc="1">
-                        <a:prstTxWarp prst="textNoShape">
-                          <a:avLst/>
-                        </a:prstTxWarp>
-                        <a:noAutofit/>
-                      </wps:bodyPr>
-                    </wps:wsp>
-                  </a:graphicData>
-                </a:graphic>
-                <wp14:sizeRelH relativeFrom="margin">
-                  <wp14:pctWidth>0</wp14:pctWidth>
-                </wp14:sizeRelH>
-                <wp14:sizeRelV relativeFrom="margin">
-                  <wp14:pctHeight>0</wp14:pctHeight>
-                </wp14:sizeRelV>
-              </wp:anchor>
-            </w:drawing>
-          </mc:Choice>
-          <mc:Fallback>
-            <w:pict>
-              <v:oval w14:anchorId="262A1B8D" id="Ellipse 4" o:spid="_x0000_s1029" style="position:absolute;left:0;text-align:left;margin-left:386.45pt;margin-top:290.95pt;width:180pt;height:180pt;z-index:251729920;visibility:visible;mso-wrap-style:square;mso-width-percent:0;mso-height-percent:0;mso-wrap-distance-left:9pt;mso-wrap-distance-top:0;mso-wrap-distance-right:9pt;mso-wrap-distance-bottom:0;mso-position-horizontal:absolute;mso-position-horizontal-relative:text;mso-position-vertical:absolute;mso-position-vertical-relative:text;mso-width-percent:0;mso-height-percent:0;mso-width-relative:margin;mso-height-relative:margin;v-text-anchor:middle" o:gfxdata="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" fillcolor="#ff0020" stroked="f" strokeweight="1pt">
-                <v:stroke joinstyle="miter"/>
-                <v:textbox>
-                  <w:txbxContent>
-                    <w:p>
-                      <w:pPr>
-                        <w:spacing w:after="0"/>
-                        <w:jc w:val="center"/>
-                        <w:rPr>
-                          <w:b/>
-                          <w:bCs/>
-                          <w:sz w:val="48"/>
-                          <w:szCs w:val="48"/>
-                        </w:rPr>
-                      </w:pPr>
-                      <w:r>
-                        <w:rPr>
-                          <w:b/>
-                          <w:bCs/>
-                          <w:sz w:val="48"/>
-                          <w:szCs w:val="48"/>
-                        </w:rPr>
-                        <w:t>13.09.2025</w:t>
-                      </w:r>
-                    </w:p>
-                    <w:p>
-                      <w:pPr>
-                        <w:jc w:val="center"/>
-                        <w:rPr>
-                          <w:b/>
-                          <w:bCs/>
-                          <w:sz w:val="48"/>
-                          <w:szCs w:val="48"/>
-                        </w:rPr>
-                      </w:pPr>
-                      <w:r>
-                        <w:rPr>
-                          <w:b/>
-                          <w:bCs/>
-                          <w:sz w:val="48"/>
-                          <w:szCs w:val="48"/>
-                        </w:rPr>
-                        <w:t>15:00 Uhr</w:t>
-                      </w:r>
-                    </w:p>
-                  </w:txbxContent>
-                </v:textbox>
-              </v:oval>
-            </w:pict>
-          </mc:Fallback>
-        </mc:AlternateContent>
-      </w:r>
-      <w:r>
-        <w:rPr>
-          <w:noProof/>
-        </w:rPr>
         <w:drawing>
-          <wp:anchor distT="0" distB="0" distL="114300" distR="114300" simplePos="0" relativeHeight="251725311" behindDoc="0" locked="0" layoutInCell="1" allowOverlap="1" wp14:anchorId="0BC5985E" wp14:editId="593201E7">
+          <wp:anchor distT="0" distB="0" distL="114300" distR="114300" simplePos="0" relativeHeight="251660288" behindDoc="0" locked="0" layoutInCell="1" allowOverlap="1" wp14:anchorId="6DCE6DAC" wp14:editId="6E0A25B3">
             <wp:simplePos x="0" y="0"/>
-            <wp:positionH relativeFrom="margin">
-              <wp:align>left</wp:align>
+            <wp:positionH relativeFrom="column">
+              <wp:posOffset>4743450</wp:posOffset>
             </wp:positionH>
-            <wp:positionV relativeFrom="margin">
-              <wp:posOffset>2781300</wp:posOffset>
+            <wp:positionV relativeFrom="paragraph">
+              <wp:posOffset>7334250</wp:posOffset>
             </wp:positionV>
-            <wp:extent cx="5041900" cy="7562850"/>
-            <wp:effectExtent l="0" t="0" r="6350" b="0"/>
-            <wp:wrapSquare wrapText="bothSides"/>
-            <wp:docPr id="1480172198" name="Grafik 2"/>
+            <wp:extent cx="2303145" cy="2303145"/>
+            <wp:effectExtent l="0" t="0" r="0" b="1905"/>
+            <wp:wrapTight wrapText="bothSides">
+              <wp:wrapPolygon edited="0">
+                <wp:start x="10005" y="0"/>
+                <wp:lineTo x="1787" y="4824"/>
+                <wp:lineTo x="1072" y="5360"/>
+                <wp:lineTo x="1072" y="15543"/>
+                <wp:lineTo x="1965" y="17151"/>
+                <wp:lineTo x="2680" y="17151"/>
+                <wp:lineTo x="10005" y="21439"/>
+                <wp:lineTo x="11613" y="21439"/>
+                <wp:lineTo x="18938" y="17151"/>
+                <wp:lineTo x="19653" y="17151"/>
+                <wp:lineTo x="20546" y="15365"/>
+                <wp:lineTo x="20546" y="5538"/>
+                <wp:lineTo x="19295" y="4467"/>
+                <wp:lineTo x="11613" y="0"/>
+                <wp:lineTo x="10005" y="0"/>
+              </wp:wrapPolygon>
+            </wp:wrapTight>
+            <wp:docPr id="668185663" name="Grafik 1"/>
             <wp:cNvGraphicFramePr>
               <a:graphicFrameLocks xmlns:a="http://schemas.openxmlformats.org/drawingml/2006/main" noChangeAspect="1"/>
             </wp:cNvGraphicFramePr>
@@ -1118,11 +849,19 @@
               <a:graphicData uri="http://schemas.openxmlformats.org/drawingml/2006/picture">
                 <pic:pic xmlns:pic="http://schemas.openxmlformats.org/drawingml/2006/picture">
                   <pic:nvPicPr>
-                    <pic:cNvPr id="1480172198" name="Grafik 1480172198"/>
-                    <pic:cNvPicPr/>
+                    <pic:cNvPr id="668185663" name="Grafik 1"/>
+                    <pic:cNvPicPr>
+                      <a:picLocks noChangeAspect="1"/>
+                    </pic:cNvPicPr>
                   </pic:nvPicPr>
                   <pic:blipFill>
-                    <a:blip r:embed="rId12"/>
+                    <a:blip r:embed="rId6">
+                      <a:extLst>
+                        <a:ext uri="{28A0092B-C50C-407E-A947-70E740481C1C}">
+                          <a14:useLocalDpi xmlns:a14="http://schemas.microsoft.com/office/drawing/2010/main" val="0"/>
+                        </a:ext>
+                      </a:extLst>
+                    </a:blip>
                     <a:stretch>
                       <a:fillRect/>
                     </a:stretch>
@@ -1130,7 +869,70 @@
                   <pic:spPr>
                     <a:xfrm>
                       <a:off x="0" y="0"/>
-                      <a:ext cx="5041900" cy="7562850"/>
+                      <a:ext cx="2303145" cy="2303145"/>
+                    </a:xfrm>
+                    <a:prstGeom prst="rect">
+                      <a:avLst/>
+                    </a:prstGeom>
+                    <a:ln>
+                      <a:noFill/>
+                    </a:ln>
+                  </pic:spPr>
+                </pic:pic>
+              </a:graphicData>
+            </a:graphic>
+            <wp14:sizeRelH relativeFrom="margin">
+              <wp14:pctWidth>0</wp14:pctWidth>
+            </wp14:sizeRelH>
+            <wp14:sizeRelV relativeFrom="margin">
+              <wp14:pctHeight>0</wp14:pctHeight>
+            </wp14:sizeRelV>
+          </wp:anchor>
+        </w:drawing>
+      </w:r>
+      <w:r>
+        <w:rPr>
+          <w:noProof/>
+        </w:rPr>
+        <w:drawing>
+          <wp:anchor distT="0" distB="0" distL="114300" distR="114300" simplePos="0" relativeHeight="251654144" behindDoc="0" locked="0" layoutInCell="1" allowOverlap="1" wp14:anchorId="5DC02A3A" wp14:editId="57D832AA">
+            <wp:simplePos x="0" y="0"/>
+            <wp:positionH relativeFrom="margin">
+              <wp:align>right</wp:align>
+            </wp:positionH>
+            <wp:positionV relativeFrom="margin">
+              <wp:align>bottom</wp:align>
+            </wp:positionV>
+            <wp:extent cx="8231505" cy="7829550"/>
+            <wp:effectExtent l="0" t="0" r="0" b="0"/>
+            <wp:wrapSquare wrapText="bothSides"/>
+            <wp:docPr id="1926537732" name="Grafik 12"/>
+            <wp:cNvGraphicFramePr>
+              <a:graphicFrameLocks xmlns:a="http://schemas.openxmlformats.org/drawingml/2006/main" noChangeAspect="1"/>
+            </wp:cNvGraphicFramePr>
+            <a:graphic xmlns:a="http://schemas.openxmlformats.org/drawingml/2006/main">
+              <a:graphicData uri="http://schemas.openxmlformats.org/drawingml/2006/picture">
+                <pic:pic xmlns:pic="http://schemas.openxmlformats.org/drawingml/2006/picture">
+                  <pic:nvPicPr>
+                    <pic:cNvPr id="1926537732" name="Grafik 12"/>
+                    <pic:cNvPicPr/>
+                  </pic:nvPicPr>
+                  <pic:blipFill>
+                    <a:blip r:embed="rId7">
+                      <a:extLst>
+                        <a:ext uri="{28A0092B-C50C-407E-A947-70E740481C1C}">
+                          <a14:useLocalDpi xmlns:a14="http://schemas.microsoft.com/office/drawing/2010/main" val="0"/>
+                        </a:ext>
+                      </a:extLst>
+                    </a:blip>
+                    <a:stretch>
+                      <a:fillRect/>
+                    </a:stretch>
+                  </pic:blipFill>
+                  <pic:spPr>
+                    <a:xfrm>
+                      <a:off x="0" y="0"/>
+                      <a:ext cx="8231505" cy="7829550"/>
                     </a:xfrm>
                     <a:prstGeom prst="rect">
                       <a:avLst/>
@@ -1155,87 +957,278 @@
         <mc:AlternateContent>
           <mc:Choice Requires="wps">
             <w:drawing>
-              <wp:anchor distT="0" distB="0" distL="114300" distR="114300" simplePos="0" relativeHeight="251716608" behindDoc="0" locked="0" layoutInCell="1" allowOverlap="1" wp14:anchorId="19C34078" wp14:editId="481FA85B">
+              <wp:anchor distT="45720" distB="45720" distL="114300" distR="114300" simplePos="0" relativeHeight="251657216" behindDoc="0" locked="0" layoutInCell="1" allowOverlap="1" wp14:anchorId="5154C9BE" wp14:editId="0EFA1A1F">
                 <wp:simplePos x="0" y="0"/>
                 <wp:positionH relativeFrom="margin">
-                  <wp:posOffset>46990</wp:posOffset>
+                  <wp:posOffset>986155</wp:posOffset>
                 </wp:positionH>
                 <wp:positionV relativeFrom="paragraph">
-                  <wp:posOffset>1159881</wp:posOffset>
+                  <wp:posOffset>11247755</wp:posOffset>
                 </wp:positionV>
-                <wp:extent cx="8183880" cy="1734185"/>
+                <wp:extent cx="6258560" cy="1962150"/>
                 <wp:effectExtent l="0" t="0" r="0" b="0"/>
-                <wp:wrapNone/>
-                <wp:docPr id="2" name="Textfeld 2"/>
-                <wp:cNvGraphicFramePr/>
+                <wp:wrapSquare wrapText="bothSides"/>
+                <wp:docPr id="217" name="Textfeld 2"/>
+                <wp:cNvGraphicFramePr>
+                  <a:graphicFrameLocks xmlns:a="http://schemas.openxmlformats.org/drawingml/2006/main"/>
+                </wp:cNvGraphicFramePr>
                 <a:graphic xmlns:a="http://schemas.openxmlformats.org/drawingml/2006/main">
                   <a:graphicData uri="http://schemas.microsoft.com/office/word/2010/wordprocessingShape">
                     <wps:wsp>
-                      <wps:cNvSpPr txBox="1"/>
-                      <wps:spPr>
+                      <wps:cNvSpPr txBox="1">
+                        <a:spLocks noChangeArrowheads="1"/>
+                      </wps:cNvSpPr>
+                      <wps:spPr bwMode="auto">
                         <a:xfrm>
                           <a:off x="0" y="0"/>
-                          <a:ext cx="8183880" cy="1734185"/>
+                          <a:ext cx="6258560" cy="1962150"/>
                         </a:xfrm>
                         <a:prstGeom prst="rect">
                           <a:avLst/>
                         </a:prstGeom>
                         <a:noFill/>
-                        <a:ln>
+                        <a:ln w="9525">
                           <a:noFill/>
+                          <a:miter lim="800000"/>
+                          <a:headEnd/>
+                          <a:tailEnd/>
                         </a:ln>
                       </wps:spPr>
                       <wps:txbx>
                         <w:txbxContent>
+                          <w:tbl>
+                            <w:tblPr>
+                              <w:tblStyle w:val="Tabellenraster"/>
+                              <w:tblW w:w="8080" w:type="dxa"/>
+                              <w:jc w:val="center"/>
+                              <w:tblBorders>
+                                <w:top w:val="none" w:sz="0" w:space="0" w:color="auto"/>
+                                <w:left w:val="none" w:sz="0" w:space="0" w:color="auto"/>
+                                <w:bottom w:val="none" w:sz="0" w:space="0" w:color="auto"/>
+                                <w:right w:val="none" w:sz="0" w:space="0" w:color="auto"/>
+                                <w:insideH w:val="none" w:sz="0" w:space="0" w:color="auto"/>
+                                <w:insideV w:val="none" w:sz="0" w:space="0" w:color="auto"/>
+                              </w:tblBorders>
+                              <w:tblLook w:val="04A0" w:firstRow="1" w:lastRow="0" w:firstColumn="1" w:lastColumn="0" w:noHBand="0" w:noVBand="1"/>
+                            </w:tblPr>
+                            <w:tblGrid>
+                              <w:gridCol w:w="1278"/>
+                              <w:gridCol w:w="6802"/>
+                            </w:tblGrid>
+                            <w:tr>
+                              <w:trPr>
+                                <w:trHeight w:val="1319"/>
+                                <w:jc w:val="center"/>
+                              </w:trPr>
+                              <w:tc>
+                                <w:tcPr>
+                                  <w:tcW w:w="1278" w:type="dxa"/>
+                                  <w:vAlign w:val="center"/>
+                                </w:tcPr>
+                                <w:p>
+                                  <w:pPr>
+                                    <w:jc w:val="center"/>
+                                    <w:rPr>
+                                      <w:b/>
+                                      <w:bCs/>
+                                      <w:color w:val="FFFFFF" w:themeColor="background1"/>
+                                      <w:sz w:val="44"/>
+                                      <w:szCs w:val="44"/>
+                                    </w:rPr>
+                                  </w:pPr>
+                                  <w:r>
+                                    <w:rPr>
+                                      <w:b/>
+                                      <w:bCs/>
+                                      <w:noProof/>
+                                      <w:color w:val="FFFFFF" w:themeColor="background1"/>
+                                      <w:sz w:val="44"/>
+                                      <w:szCs w:val="44"/>
+                                    </w:rPr>
+                                    <w:drawing>
+                                      <wp:inline distT="0" distB="0" distL="0" distR="0" wp14:anchorId="2D344231" wp14:editId="0A7099C0">
+                                        <wp:extent cx="674648" cy="720000"/>
+                                        <wp:effectExtent l="0" t="0" r="0" b="4445"/>
+                                        <wp:docPr id="356689510" name="Grafik 15"/>
+                                        <wp:cNvGraphicFramePr>
+                                          <a:graphicFrameLocks xmlns:a="http://schemas.openxmlformats.org/drawingml/2006/main" noChangeAspect="1"/>
+                                        </wp:cNvGraphicFramePr>
+                                        <a:graphic xmlns:a="http://schemas.openxmlformats.org/drawingml/2006/main">
+                                          <a:graphicData uri="http://schemas.openxmlformats.org/drawingml/2006/picture">
+                                            <pic:pic xmlns:pic="http://schemas.openxmlformats.org/drawingml/2006/picture">
+                                              <pic:nvPicPr>
+                                                <pic:cNvPr id="356689510" name="Grafik 356689510"/>
+                                                <pic:cNvPicPr/>
+                                              </pic:nvPicPr>
+                                              <pic:blipFill>
+                                                <a:blip r:embed="rId8">
+                                                  <a:extLst>
+                                                    <a:ext uri="{28A0092B-C50C-407E-A947-70E740481C1C}">
+                                                      <a14:useLocalDpi xmlns:a14="http://schemas.microsoft.com/office/drawing/2010/main" val="0"/>
+                                                    </a:ext>
+                                                  </a:extLst>
+                                                </a:blip>
+                                                <a:stretch>
+                                                  <a:fillRect/>
+                                                </a:stretch>
+                                              </pic:blipFill>
+                                              <pic:spPr>
+                                                <a:xfrm>
+                                                  <a:off x="0" y="0"/>
+                                                  <a:ext cx="674648" cy="720000"/>
+                                                </a:xfrm>
+                                                <a:prstGeom prst="rect">
+                                                  <a:avLst/>
+                                                </a:prstGeom>
+                                              </pic:spPr>
+                                            </pic:pic>
+                                          </a:graphicData>
+                                        </a:graphic>
+                                      </wp:inline>
+                                    </w:drawing>
+                                  </w:r>
+                                </w:p>
+                              </w:tc>
+                              <w:tc>
+                                <w:tcPr>
+                                  <w:tcW w:w="6802" w:type="dxa"/>
+                                  <w:vAlign w:val="center"/>
+                                </w:tcPr>
+                                <w:p>
+                                  <w:pPr>
+                                    <w:jc w:val="center"/>
+                                    <w:rPr>
+                                      <w:b/>
+                                      <w:bCs/>
+                                      <w:color w:val="FFFFFF" w:themeColor="background1"/>
+                                      <w:sz w:val="44"/>
+                                      <w:szCs w:val="44"/>
+                                    </w:rPr>
+                                  </w:pPr>
+                                  <w:r>
+                                    <w:rPr>
+                                      <w:b/>
+                                      <w:bCs/>
+                                      <w:color w:val="FFFFFF" w:themeColor="background1"/>
+                                      <w:sz w:val="44"/>
+                                      <w:szCs w:val="44"/>
+                                    </w:rPr>
+                                    <w:t>Sonntag, 16.08.2026 | 15:00 Uhr</w:t>
+                                  </w:r>
+                                </w:p>
+                              </w:tc>
+                            </w:tr>
+                            <w:tr>
+                              <w:trPr>
+                                <w:jc w:val="center"/>
+                              </w:trPr>
+                              <w:tc>
+                                <w:tcPr>
+                                  <w:tcW w:w="1278" w:type="dxa"/>
+                                  <w:vAlign w:val="center"/>
+                                </w:tcPr>
+                                <w:p>
+                                  <w:pPr>
+                                    <w:jc w:val="center"/>
+                                    <w:rPr>
+                                      <w:b/>
+                                      <w:bCs/>
+                                      <w:color w:val="FFFFFF" w:themeColor="background1"/>
+                                      <w:sz w:val="44"/>
+                                      <w:szCs w:val="44"/>
+                                    </w:rPr>
+                                  </w:pPr>
+                                  <w:r>
+                                    <w:rPr>
+                                      <w:b/>
+                                      <w:bCs/>
+                                      <w:noProof/>
+                                      <w:color w:val="FFFFFF" w:themeColor="background1"/>
+                                      <w:sz w:val="44"/>
+                                      <w:szCs w:val="44"/>
+                                    </w:rPr>
+                                    <w:drawing>
+                                      <wp:inline distT="0" distB="0" distL="0" distR="0" wp14:anchorId="0856A6CF" wp14:editId="1F19C2CD">
+                                        <wp:extent cx="509010" cy="720000"/>
+                                        <wp:effectExtent l="0" t="0" r="5715" b="4445"/>
+                                        <wp:docPr id="1806395939" name="Grafik 17"/>
+                                        <wp:cNvGraphicFramePr>
+                                          <a:graphicFrameLocks xmlns:a="http://schemas.openxmlformats.org/drawingml/2006/main" noChangeAspect="1"/>
+                                        </wp:cNvGraphicFramePr>
+                                        <a:graphic xmlns:a="http://schemas.openxmlformats.org/drawingml/2006/main">
+                                          <a:graphicData uri="http://schemas.openxmlformats.org/drawingml/2006/picture">
+                                            <pic:pic xmlns:pic="http://schemas.openxmlformats.org/drawingml/2006/picture">
+                                              <pic:nvPicPr>
+                                                <pic:cNvPr id="1806395939" name="Grafik 17"/>
+                                                <pic:cNvPicPr/>
+                                              </pic:nvPicPr>
+                                              <pic:blipFill>
+                                                <a:blip r:embed="rId9">
+                                                  <a:extLst>
+                                                    <a:ext uri="{28A0092B-C50C-407E-A947-70E740481C1C}">
+                                                      <a14:useLocalDpi xmlns:a14="http://schemas.microsoft.com/office/drawing/2010/main" val="0"/>
+                                                    </a:ext>
+                                                  </a:extLst>
+                                                </a:blip>
+                                                <a:stretch>
+                                                  <a:fillRect/>
+                                                </a:stretch>
+                                              </pic:blipFill>
+                                              <pic:spPr>
+                                                <a:xfrm>
+                                                  <a:off x="0" y="0"/>
+                                                  <a:ext cx="509010" cy="720000"/>
+                                                </a:xfrm>
+                                                <a:prstGeom prst="rect">
+                                                  <a:avLst/>
+                                                </a:prstGeom>
+                                              </pic:spPr>
+                                            </pic:pic>
+                                          </a:graphicData>
+                                        </a:graphic>
+                                      </wp:inline>
+                                    </w:drawing>
+                                  </w:r>
+                                </w:p>
+                              </w:tc>
+                              <w:tc>
+                                <w:tcPr>
+                                  <w:tcW w:w="6802" w:type="dxa"/>
+                                  <w:vAlign w:val="center"/>
+                                </w:tcPr>
+                                <w:p>
+                                  <w:pPr>
+                                    <w:jc w:val="center"/>
+                                    <w:rPr>
+                                      <w:b/>
+                                      <w:bCs/>
+                                      <w:color w:val="FFFFFF" w:themeColor="background1"/>
+                                      <w:sz w:val="44"/>
+                                      <w:szCs w:val="44"/>
+                                    </w:rPr>
+                                  </w:pPr>
+                                  <w:r>
+                                    <w:rPr>
+                                      <w:b/>
+                                      <w:bCs/>
+                                      <w:color w:val="FFFFFF" w:themeColor="background1"/>
+                                      <w:sz w:val="44"/>
+                                      <w:szCs w:val="44"/>
+                                    </w:rPr>
+                                    <w:t>Friedrich-Ludwig-Jahn Stadion</w:t>
+                                  </w:r>
+                                </w:p>
+                              </w:tc>
+                            </w:tr>
+                          </w:tbl>
                           <w:p>
                             <w:pPr>
                               <w:jc w:val="center"/>
-                              <w:rPr>
-                                <w:rFonts w:ascii="Arial" w:hAnsi="Arial" w:cs="Arial"/>
-                                <w:b/>
-                                <w:bCs/>
-                                <w:noProof/>
-                                <w:color w:val="FFFFFF" w:themeColor="background1"/>
-                                <w:sz w:val="210"/>
-                                <w:szCs w:val="210"/>
-                                <w14:shadow w14:blurRad="38100" w14:dist="19050" w14:dir="2700000" w14:sx="100000" w14:sy="100000" w14:kx="0" w14:ky="0" w14:algn="tl">
-                                  <w14:schemeClr w14:val="dk1">
-                                    <w14:alpha w14:val="60000"/>
-                                  </w14:schemeClr>
-                                </w14:shadow>
-                                <w14:textOutline w14:w="0" w14:cap="flat" w14:cmpd="sng" w14:algn="ctr">
-                                  <w14:noFill/>
-                                  <w14:prstDash w14:val="solid"/>
-                                  <w14:round/>
-                                </w14:textOutline>
-                              </w:rPr>
                             </w:pPr>
-                            <w:r>
-                              <w:rPr>
-                                <w:rFonts w:ascii="Arial" w:hAnsi="Arial" w:cs="Arial"/>
-                                <w:b/>
-                                <w:bCs/>
-                                <w:noProof/>
-                                <w:color w:val="FFFFFF" w:themeColor="background1"/>
-                                <w:sz w:val="210"/>
-                                <w:szCs w:val="210"/>
-                                <w14:shadow w14:blurRad="38100" w14:dist="19050" w14:dir="2700000" w14:sx="100000" w14:sy="100000" w14:kx="0" w14:ky="0" w14:algn="tl">
-                                  <w14:schemeClr w14:val="dk1">
-                                    <w14:alpha w14:val="60000"/>
-                                  </w14:schemeClr>
-                                </w14:shadow>
-                                <w14:textOutline w14:w="0" w14:cap="flat" w14:cmpd="sng" w14:algn="ctr">
-                                  <w14:noFill/>
-                                  <w14:prstDash w14:val="solid"/>
-                                  <w14:round/>
-                                </w14:textOutline>
-                              </w:rPr>
-                              <w:t>5. Spieltag</w:t>
-                            </w:r>
                           </w:p>
                         </w:txbxContent>
                       </wps:txbx>
-                      <wps:bodyPr rot="0" spcFirstLastPara="0" vertOverflow="overflow" horzOverflow="overflow" vert="horz" wrap="square" lIns="91440" tIns="45720" rIns="91440" bIns="45720" numCol="1" spcCol="0" rtlCol="0" fromWordArt="0" anchor="t" anchorCtr="0" forceAA="0" compatLnSpc="1">
+                      <wps:bodyPr rot="0" vert="horz" wrap="square" lIns="91440" tIns="45720" rIns="91440" bIns="45720" anchor="ctr" anchorCtr="0">
                         <a:noAutofit/>
                       </wps:bodyPr>
                     </wps:wsp>
@@ -1244,63 +1237,250 @@
                 <wp14:sizeRelH relativeFrom="margin">
                   <wp14:pctWidth>0</wp14:pctWidth>
                 </wp14:sizeRelH>
+                <wp14:sizeRelV relativeFrom="margin">
+                  <wp14:pctHeight>0</wp14:pctHeight>
+                </wp14:sizeRelV>
               </wp:anchor>
             </w:drawing>
           </mc:Choice>
           <mc:Fallback>
             <w:pict>
-              <v:shape w14:anchorId="19C34078" id="Textfeld 2" o:spid="_x0000_s1030" type="#_x0000_t202" style="position:absolute;left:0;text-align:left;margin-left:3.7pt;margin-top:91.35pt;width:644.4pt;height:136.55pt;z-index:251716608;visibility:visible;mso-wrap-style:square;mso-width-percent:0;mso-wrap-distance-left:9pt;mso-wrap-distance-top:0;mso-wrap-distance-right:9pt;mso-wrap-distance-bottom:0;mso-position-horizontal:absolute;mso-position-horizontal-relative:margin;mso-position-vertical:absolute;mso-position-vertical-relative:text;mso-width-percent:0;mso-width-relative:margin;v-text-anchor:top" o:gfxdata="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" filled="f" stroked="f">
+              <v:shape w14:anchorId="5154C9BE" id="Textfeld 2" o:spid="_x0000_s1029" type="#_x0000_t202" style="position:absolute;margin-left:77.65pt;margin-top:885.65pt;width:492.8pt;height:154.5pt;z-index:251657216;visibility:visible;mso-wrap-style:square;mso-width-percent:0;mso-height-percent:0;mso-wrap-distance-left:9pt;mso-wrap-distance-top:3.6pt;mso-wrap-distance-right:9pt;mso-wrap-distance-bottom:3.6pt;mso-position-horizontal:absolute;mso-position-horizontal-relative:margin;mso-position-vertical:absolute;mso-position-vertical-relative:text;mso-width-percent:0;mso-height-percent:0;mso-width-relative:margin;mso-height-relative:margin;v-text-anchor:middle" o:gfxdata="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" filled="f" stroked="f">
                 <v:textbox>
                   <w:txbxContent>
+                    <w:tbl>
+                      <w:tblPr>
+                        <w:tblStyle w:val="Tabellenraster"/>
+                        <w:tblW w:w="8080" w:type="dxa"/>
+                        <w:jc w:val="center"/>
+                        <w:tblBorders>
+                          <w:top w:val="none" w:sz="0" w:space="0" w:color="auto"/>
+                          <w:left w:val="none" w:sz="0" w:space="0" w:color="auto"/>
+                          <w:bottom w:val="none" w:sz="0" w:space="0" w:color="auto"/>
+                          <w:right w:val="none" w:sz="0" w:space="0" w:color="auto"/>
+                          <w:insideH w:val="none" w:sz="0" w:space="0" w:color="auto"/>
+                          <w:insideV w:val="none" w:sz="0" w:space="0" w:color="auto"/>
+                        </w:tblBorders>
+                        <w:tblLook w:val="04A0" w:firstRow="1" w:lastRow="0" w:firstColumn="1" w:lastColumn="0" w:noHBand="0" w:noVBand="1"/>
+                      </w:tblPr>
+                      <w:tblGrid>
+                        <w:gridCol w:w="1278"/>
+                        <w:gridCol w:w="6802"/>
+                      </w:tblGrid>
+                      <w:tr>
+                        <w:trPr>
+                          <w:trHeight w:val="1319"/>
+                          <w:jc w:val="center"/>
+                        </w:trPr>
+                        <w:tc>
+                          <w:tcPr>
+                            <w:tcW w:w="1278" w:type="dxa"/>
+                            <w:vAlign w:val="center"/>
+                          </w:tcPr>
+                          <w:p>
+                            <w:pPr>
+                              <w:jc w:val="center"/>
+                              <w:rPr>
+                                <w:b/>
+                                <w:bCs/>
+                                <w:color w:val="FFFFFF" w:themeColor="background1"/>
+                                <w:sz w:val="44"/>
+                                <w:szCs w:val="44"/>
+                              </w:rPr>
+                            </w:pPr>
+                            <w:r>
+                              <w:rPr>
+                                <w:b/>
+                                <w:bCs/>
+                                <w:noProof/>
+                                <w:color w:val="FFFFFF" w:themeColor="background1"/>
+                                <w:sz w:val="44"/>
+                                <w:szCs w:val="44"/>
+                              </w:rPr>
+                              <w:drawing>
+                                <wp:inline distT="0" distB="0" distL="0" distR="0" wp14:anchorId="2D344231" wp14:editId="0A7099C0">
+                                  <wp:extent cx="674648" cy="720000"/>
+                                  <wp:effectExtent l="0" t="0" r="0" b="4445"/>
+                                  <wp:docPr id="356689510" name="Grafik 15"/>
+                                  <wp:cNvGraphicFramePr>
+                                    <a:graphicFrameLocks xmlns:a="http://schemas.openxmlformats.org/drawingml/2006/main" noChangeAspect="1"/>
+                                  </wp:cNvGraphicFramePr>
+                                  <a:graphic xmlns:a="http://schemas.openxmlformats.org/drawingml/2006/main">
+                                    <a:graphicData uri="http://schemas.openxmlformats.org/drawingml/2006/picture">
+                                      <pic:pic xmlns:pic="http://schemas.openxmlformats.org/drawingml/2006/picture">
+                                        <pic:nvPicPr>
+                                          <pic:cNvPr id="356689510" name="Grafik 356689510"/>
+                                          <pic:cNvPicPr/>
+                                        </pic:nvPicPr>
+                                        <pic:blipFill>
+                                          <a:blip r:embed="rId8">
+                                            <a:extLst>
+                                              <a:ext uri="{28A0092B-C50C-407E-A947-70E740481C1C}">
+                                                <a14:useLocalDpi xmlns:a14="http://schemas.microsoft.com/office/drawing/2010/main" val="0"/>
+                                              </a:ext>
+                                            </a:extLst>
+                                          </a:blip>
+                                          <a:stretch>
+                                            <a:fillRect/>
+                                          </a:stretch>
+                                        </pic:blipFill>
+                                        <pic:spPr>
+                                          <a:xfrm>
+                                            <a:off x="0" y="0"/>
+                                            <a:ext cx="674648" cy="720000"/>
+                                          </a:xfrm>
+                                          <a:prstGeom prst="rect">
+                                            <a:avLst/>
+                                          </a:prstGeom>
+                                        </pic:spPr>
+                                      </pic:pic>
+                                    </a:graphicData>
+                                  </a:graphic>
+                                </wp:inline>
+                              </w:drawing>
+                            </w:r>
+                          </w:p>
+                        </w:tc>
+                        <w:tc>
+                          <w:tcPr>
+                            <w:tcW w:w="6802" w:type="dxa"/>
+                            <w:vAlign w:val="center"/>
+                          </w:tcPr>
+                          <w:p>
+                            <w:pPr>
+                              <w:jc w:val="center"/>
+                              <w:rPr>
+                                <w:b/>
+                                <w:bCs/>
+                                <w:color w:val="FFFFFF" w:themeColor="background1"/>
+                                <w:sz w:val="44"/>
+                                <w:szCs w:val="44"/>
+                              </w:rPr>
+                            </w:pPr>
+                            <w:r>
+                              <w:rPr>
+                                <w:b/>
+                                <w:bCs/>
+                                <w:color w:val="FFFFFF" w:themeColor="background1"/>
+                                <w:sz w:val="44"/>
+                                <w:szCs w:val="44"/>
+                              </w:rPr>
+                              <w:t>Sonntag, 16.08.2026 | 15:00 Uhr</w:t>
+                            </w:r>
+                          </w:p>
+                        </w:tc>
+                      </w:tr>
+                      <w:tr>
+                        <w:trPr>
+                          <w:jc w:val="center"/>
+                        </w:trPr>
+                        <w:tc>
+                          <w:tcPr>
+                            <w:tcW w:w="1278" w:type="dxa"/>
+                            <w:vAlign w:val="center"/>
+                          </w:tcPr>
+                          <w:p>
+                            <w:pPr>
+                              <w:jc w:val="center"/>
+                              <w:rPr>
+                                <w:b/>
+                                <w:bCs/>
+                                <w:color w:val="FFFFFF" w:themeColor="background1"/>
+                                <w:sz w:val="44"/>
+                                <w:szCs w:val="44"/>
+                              </w:rPr>
+                            </w:pPr>
+                            <w:r>
+                              <w:rPr>
+                                <w:b/>
+                                <w:bCs/>
+                                <w:noProof/>
+                                <w:color w:val="FFFFFF" w:themeColor="background1"/>
+                                <w:sz w:val="44"/>
+                                <w:szCs w:val="44"/>
+                              </w:rPr>
+                              <w:drawing>
+                                <wp:inline distT="0" distB="0" distL="0" distR="0" wp14:anchorId="0856A6CF" wp14:editId="1F19C2CD">
+                                  <wp:extent cx="509010" cy="720000"/>
+                                  <wp:effectExtent l="0" t="0" r="5715" b="4445"/>
+                                  <wp:docPr id="1806395939" name="Grafik 17"/>
+                                  <wp:cNvGraphicFramePr>
+                                    <a:graphicFrameLocks xmlns:a="http://schemas.openxmlformats.org/drawingml/2006/main" noChangeAspect="1"/>
+                                  </wp:cNvGraphicFramePr>
+                                  <a:graphic xmlns:a="http://schemas.openxmlformats.org/drawingml/2006/main">
+                                    <a:graphicData uri="http://schemas.openxmlformats.org/drawingml/2006/picture">
+                                      <pic:pic xmlns:pic="http://schemas.openxmlformats.org/drawingml/2006/picture">
+                                        <pic:nvPicPr>
+                                          <pic:cNvPr id="1806395939" name="Grafik 17"/>
+                                          <pic:cNvPicPr/>
+                                        </pic:nvPicPr>
+                                        <pic:blipFill>
+                                          <a:blip r:embed="rId9">
+                                            <a:extLst>
+                                              <a:ext uri="{28A0092B-C50C-407E-A947-70E740481C1C}">
+                                                <a14:useLocalDpi xmlns:a14="http://schemas.microsoft.com/office/drawing/2010/main" val="0"/>
+                                              </a:ext>
+                                            </a:extLst>
+                                          </a:blip>
+                                          <a:stretch>
+                                            <a:fillRect/>
+                                          </a:stretch>
+                                        </pic:blipFill>
+                                        <pic:spPr>
+                                          <a:xfrm>
+                                            <a:off x="0" y="0"/>
+                                            <a:ext cx="509010" cy="720000"/>
+                                          </a:xfrm>
+                                          <a:prstGeom prst="rect">
+                                            <a:avLst/>
+                                          </a:prstGeom>
+                                        </pic:spPr>
+                                      </pic:pic>
+                                    </a:graphicData>
+                                  </a:graphic>
+                                </wp:inline>
+                              </w:drawing>
+                            </w:r>
+                          </w:p>
+                        </w:tc>
+                        <w:tc>
+                          <w:tcPr>
+                            <w:tcW w:w="6802" w:type="dxa"/>
+                            <w:vAlign w:val="center"/>
+                          </w:tcPr>
+                          <w:p>
+                            <w:pPr>
+                              <w:jc w:val="center"/>
+                              <w:rPr>
+                                <w:b/>
+                                <w:bCs/>
+                                <w:color w:val="FFFFFF" w:themeColor="background1"/>
+                                <w:sz w:val="44"/>
+                                <w:szCs w:val="44"/>
+                              </w:rPr>
+                            </w:pPr>
+                            <w:r>
+                              <w:rPr>
+                                <w:b/>
+                                <w:bCs/>
+                                <w:color w:val="FFFFFF" w:themeColor="background1"/>
+                                <w:sz w:val="44"/>
+                                <w:szCs w:val="44"/>
+                              </w:rPr>
+                              <w:t>Friedrich-Ludwig-Jahn Stadion</w:t>
+                            </w:r>
+                          </w:p>
+                        </w:tc>
+                      </w:tr>
+                    </w:tbl>
                     <w:p>
                       <w:pPr>
                         <w:jc w:val="center"/>
-                        <w:rPr>
-                          <w:rFonts w:ascii="Arial" w:hAnsi="Arial" w:cs="Arial"/>
-                          <w:b/>
-                          <w:bCs/>
-                          <w:noProof/>
-                          <w:color w:val="FFFFFF" w:themeColor="background1"/>
-                          <w:sz w:val="210"/>
-                          <w:szCs w:val="210"/>
-                          <w14:shadow w14:blurRad="38100" w14:dist="19050" w14:dir="2700000" w14:sx="100000" w14:sy="100000" w14:kx="0" w14:ky="0" w14:algn="tl">
-                            <w14:schemeClr w14:val="dk1">
-                              <w14:alpha w14:val="60000"/>
-                            </w14:schemeClr>
-                          </w14:shadow>
-                          <w14:textOutline w14:w="0" w14:cap="flat" w14:cmpd="sng" w14:algn="ctr">
-                            <w14:noFill/>
-                            <w14:prstDash w14:val="solid"/>
-                            <w14:round/>
-                          </w14:textOutline>
-                        </w:rPr>
                       </w:pPr>
-                      <w:r>
-                        <w:rPr>
-                          <w:rFonts w:ascii="Arial" w:hAnsi="Arial" w:cs="Arial"/>
-                          <w:b/>
-                          <w:bCs/>
-                          <w:noProof/>
-                          <w:color w:val="FFFFFF" w:themeColor="background1"/>
-                          <w:sz w:val="210"/>
-                          <w:szCs w:val="210"/>
-                          <w14:shadow w14:blurRad="38100" w14:dist="19050" w14:dir="2700000" w14:sx="100000" w14:sy="100000" w14:kx="0" w14:ky="0" w14:algn="tl">
-                            <w14:schemeClr w14:val="dk1">
-                              <w14:alpha w14:val="60000"/>
-                            </w14:schemeClr>
-                          </w14:shadow>
-                          <w14:textOutline w14:w="0" w14:cap="flat" w14:cmpd="sng" w14:algn="ctr">
-                            <w14:noFill/>
-                            <w14:prstDash w14:val="solid"/>
-                            <w14:round/>
-                          </w14:textOutline>
-                        </w:rPr>
-                        <w:t>5. Spieltag</w:t>
-                      </w:r>
                     </w:p>
                   </w:txbxContent>
                 </v:textbox>
-                <w10:wrap anchorx="margin"/>
+                <w10:wrap type="square" anchorx="margin"/>
               </v:shape>
             </w:pict>
           </mc:Fallback>
@@ -1311,18 +1491,48 @@
           <w:noProof/>
         </w:rPr>
         <w:drawing>
-          <wp:anchor distT="0" distB="0" distL="114300" distR="114300" simplePos="0" relativeHeight="251590655" behindDoc="0" locked="0" layoutInCell="1" allowOverlap="1" wp14:anchorId="4E527612" wp14:editId="63BE5639">
+          <wp:anchor distT="0" distB="0" distL="114300" distR="114300" simplePos="0" relativeHeight="251658244" behindDoc="0" locked="0" layoutInCell="1" allowOverlap="1" wp14:anchorId="57FE8127" wp14:editId="3D996165">
             <wp:simplePos x="0" y="0"/>
-            <wp:positionH relativeFrom="margin">
-              <wp:posOffset>-3175</wp:posOffset>
+            <wp:positionH relativeFrom="column">
+              <wp:posOffset>1172845</wp:posOffset>
             </wp:positionH>
-            <wp:positionV relativeFrom="margin">
-              <wp:posOffset>-4445</wp:posOffset>
+            <wp:positionV relativeFrom="paragraph">
+              <wp:posOffset>7343775</wp:posOffset>
             </wp:positionV>
-            <wp:extent cx="8244000" cy="14702557"/>
-            <wp:effectExtent l="0" t="0" r="5080" b="4445"/>
-            <wp:wrapSquare wrapText="bothSides"/>
-            <wp:docPr id="791261351" name="Grafik 1"/>
+            <wp:extent cx="2304415" cy="2306320"/>
+            <wp:effectExtent l="0" t="0" r="0" b="0"/>
+            <wp:wrapTight wrapText="bothSides">
+              <wp:wrapPolygon edited="0">
+                <wp:start x="8392" y="0"/>
+                <wp:lineTo x="5535" y="178"/>
+                <wp:lineTo x="3036" y="1784"/>
+                <wp:lineTo x="3393" y="6780"/>
+                <wp:lineTo x="4464" y="8564"/>
+                <wp:lineTo x="3214" y="9456"/>
+                <wp:lineTo x="2857" y="9991"/>
+                <wp:lineTo x="3214" y="12311"/>
+                <wp:lineTo x="4285" y="14273"/>
+                <wp:lineTo x="3214" y="16236"/>
+                <wp:lineTo x="3214" y="16414"/>
+                <wp:lineTo x="10357" y="21410"/>
+                <wp:lineTo x="11428" y="21410"/>
+                <wp:lineTo x="17320" y="17128"/>
+                <wp:lineTo x="18392" y="16949"/>
+                <wp:lineTo x="18213" y="16236"/>
+                <wp:lineTo x="17320" y="14273"/>
+                <wp:lineTo x="18392" y="12132"/>
+                <wp:lineTo x="18749" y="10348"/>
+                <wp:lineTo x="18213" y="9456"/>
+                <wp:lineTo x="16428" y="8564"/>
+                <wp:lineTo x="17142" y="8564"/>
+                <wp:lineTo x="18392" y="6601"/>
+                <wp:lineTo x="18570" y="1606"/>
+                <wp:lineTo x="15535" y="178"/>
+                <wp:lineTo x="12321" y="0"/>
+                <wp:lineTo x="8392" y="0"/>
+              </wp:wrapPolygon>
+            </wp:wrapTight>
+            <wp:docPr id="1776096362" name="Grafik 2"/>
             <wp:cNvGraphicFramePr>
               <a:graphicFrameLocks xmlns:a="http://schemas.openxmlformats.org/drawingml/2006/main" noChangeAspect="1"/>
             </wp:cNvGraphicFramePr>
@@ -1330,7 +1540,208 @@
               <a:graphicData uri="http://schemas.openxmlformats.org/drawingml/2006/picture">
                 <pic:pic xmlns:pic="http://schemas.openxmlformats.org/drawingml/2006/picture">
                   <pic:nvPicPr>
-                    <pic:cNvPr id="791261351" name="Grafik 1"/>
+                    <pic:cNvPr id="1776096362" name="Grafik 2"/>
+                    <pic:cNvPicPr>
+                      <a:picLocks noChangeAspect="1"/>
+                    </pic:cNvPicPr>
+                  </pic:nvPicPr>
+                  <pic:blipFill>
+                    <a:blip r:embed="rId10">
+                      <a:extLst>
+                        <a:ext uri="{28A0092B-C50C-407E-A947-70E740481C1C}">
+                          <a14:useLocalDpi xmlns:a14="http://schemas.microsoft.com/office/drawing/2010/main" val="0"/>
+                        </a:ext>
+                      </a:extLst>
+                    </a:blip>
+                    <a:stretch>
+                      <a:fillRect/>
+                    </a:stretch>
+                  </pic:blipFill>
+                  <pic:spPr>
+                    <a:xfrm>
+                      <a:off x="0" y="0"/>
+                      <a:ext cx="2304415" cy="2306320"/>
+                    </a:xfrm>
+                    <a:prstGeom prst="rect">
+                      <a:avLst/>
+                    </a:prstGeom>
+                    <a:ln>
+                      <a:noFill/>
+                    </a:ln>
+                  </pic:spPr>
+                </pic:pic>
+              </a:graphicData>
+            </a:graphic>
+          </wp:anchor>
+        </w:drawing>
+      </w:r>
+      <w:r>
+        <w:rPr>
+          <w:noProof/>
+        </w:rPr>
+        <w:drawing>
+          <wp:anchor distT="0" distB="0" distL="114300" distR="114300" simplePos="0" relativeHeight="251658243" behindDoc="0" locked="0" layoutInCell="1" allowOverlap="1" wp14:anchorId="6021E05C" wp14:editId="2762A9ED">
+            <wp:simplePos x="0" y="0"/>
+            <wp:positionH relativeFrom="margin">
+              <wp:posOffset>3496310</wp:posOffset>
+            </wp:positionH>
+            <wp:positionV relativeFrom="paragraph">
+              <wp:posOffset>7729855</wp:posOffset>
+            </wp:positionV>
+            <wp:extent cx="1231900" cy="1515110"/>
+            <wp:effectExtent l="0" t="0" r="6350" b="8890"/>
+            <wp:wrapTight wrapText="bothSides">
+              <wp:wrapPolygon edited="0">
+                <wp:start x="16701" y="0"/>
+                <wp:lineTo x="13695" y="815"/>
+                <wp:lineTo x="9687" y="3259"/>
+                <wp:lineTo x="9687" y="4345"/>
+                <wp:lineTo x="2672" y="5160"/>
+                <wp:lineTo x="0" y="6246"/>
+                <wp:lineTo x="0" y="9505"/>
+                <wp:lineTo x="2672" y="13036"/>
+                <wp:lineTo x="4676" y="17381"/>
+                <wp:lineTo x="2004" y="21455"/>
+                <wp:lineTo x="4342" y="21455"/>
+                <wp:lineTo x="5010" y="21455"/>
+                <wp:lineTo x="15031" y="17653"/>
+                <wp:lineTo x="21043" y="13036"/>
+                <wp:lineTo x="21377" y="12221"/>
+                <wp:lineTo x="21377" y="3802"/>
+                <wp:lineTo x="18705" y="0"/>
+                <wp:lineTo x="16701" y="0"/>
+              </wp:wrapPolygon>
+            </wp:wrapTight>
+            <wp:docPr id="561467284" name="Grafik 4"/>
+            <wp:cNvGraphicFramePr>
+              <a:graphicFrameLocks xmlns:a="http://schemas.openxmlformats.org/drawingml/2006/main" noChangeAspect="1"/>
+            </wp:cNvGraphicFramePr>
+            <a:graphic xmlns:a="http://schemas.openxmlformats.org/drawingml/2006/main">
+              <a:graphicData uri="http://schemas.openxmlformats.org/drawingml/2006/picture">
+                <pic:pic xmlns:pic="http://schemas.openxmlformats.org/drawingml/2006/picture">
+                  <pic:nvPicPr>
+                    <pic:cNvPr id="561467284" name="Grafik 4"/>
+                    <pic:cNvPicPr>
+                      <a:picLocks noChangeAspect="1"/>
+                    </pic:cNvPicPr>
+                  </pic:nvPicPr>
+                  <pic:blipFill>
+                    <a:blip r:embed="rId11" cstate="print">
+                      <a:extLst>
+                        <a:ext uri="{28A0092B-C50C-407E-A947-70E740481C1C}">
+                          <a14:useLocalDpi xmlns:a14="http://schemas.microsoft.com/office/drawing/2010/main" val="0"/>
+                        </a:ext>
+                      </a:extLst>
+                    </a:blip>
+                    <a:stretch>
+                      <a:fillRect/>
+                    </a:stretch>
+                  </pic:blipFill>
+                  <pic:spPr>
+                    <a:xfrm>
+                      <a:off x="0" y="0"/>
+                      <a:ext cx="1231900" cy="1515110"/>
+                    </a:xfrm>
+                    <a:prstGeom prst="rect">
+                      <a:avLst/>
+                    </a:prstGeom>
+                    <a:ln>
+                      <a:noFill/>
+                    </a:ln>
+                  </pic:spPr>
+                </pic:pic>
+              </a:graphicData>
+            </a:graphic>
+          </wp:anchor>
+        </w:drawing>
+      </w:r>
+      <w:r>
+        <w:rPr>
+          <w:noProof/>
+        </w:rPr>
+        <w:drawing>
+          <wp:anchor distT="0" distB="0" distL="114300" distR="114300" simplePos="0" relativeHeight="251658241" behindDoc="1" locked="0" layoutInCell="1" allowOverlap="1" wp14:anchorId="41488C3C" wp14:editId="4520F7C0">
+            <wp:simplePos x="0" y="0"/>
+            <wp:positionH relativeFrom="margin">
+              <wp:align>right</wp:align>
+            </wp:positionH>
+            <wp:positionV relativeFrom="paragraph">
+              <wp:posOffset>19050</wp:posOffset>
+            </wp:positionV>
+            <wp:extent cx="8248650" cy="8248650"/>
+            <wp:effectExtent l="0" t="0" r="0" b="0"/>
+            <wp:wrapNone/>
+            <wp:docPr id="1154478307" name="Grafik 11"/>
+            <wp:cNvGraphicFramePr>
+              <a:graphicFrameLocks xmlns:a="http://schemas.openxmlformats.org/drawingml/2006/main" noChangeAspect="1"/>
+            </wp:cNvGraphicFramePr>
+            <a:graphic xmlns:a="http://schemas.openxmlformats.org/drawingml/2006/main">
+              <a:graphicData uri="http://schemas.openxmlformats.org/drawingml/2006/picture">
+                <pic:pic xmlns:pic="http://schemas.openxmlformats.org/drawingml/2006/picture">
+                  <pic:nvPicPr>
+                    <pic:cNvPr id="1154478307" name="Grafik 1154478307"/>
+                    <pic:cNvPicPr/>
+                  </pic:nvPicPr>
+                  <pic:blipFill rotWithShape="1">
+                    <a:blip r:embed="rId12">
+                      <a:alphaModFix amt="70000"/>
+                      <a:extLst>
+                        <a:ext uri="{28A0092B-C50C-407E-A947-70E740481C1C}">
+                          <a14:useLocalDpi xmlns:a14="http://schemas.microsoft.com/office/drawing/2010/main" val="0"/>
+                        </a:ext>
+                      </a:extLst>
+                    </a:blip>
+                    <a:srcRect b="20004"/>
+                    <a:stretch>
+                      <a:fillRect/>
+                    </a:stretch>
+                  </pic:blipFill>
+                  <pic:spPr bwMode="auto">
+                    <a:xfrm>
+                      <a:off x="0" y="0"/>
+                      <a:ext cx="8248650" cy="8248650"/>
+                    </a:xfrm>
+                    <a:prstGeom prst="rect">
+                      <a:avLst/>
+                    </a:prstGeom>
+                    <a:ln>
+                      <a:noFill/>
+                    </a:ln>
+                    <a:extLst>
+                      <a:ext uri="{53640926-AAD7-44D8-BBD7-CCE9431645EC}">
+                        <a14:shadowObscured xmlns:a14="http://schemas.microsoft.com/office/drawing/2010/main"/>
+                      </a:ext>
+                    </a:extLst>
+                  </pic:spPr>
+                </pic:pic>
+              </a:graphicData>
+            </a:graphic>
+            <wp14:sizeRelH relativeFrom="page">
+              <wp14:pctWidth>0</wp14:pctWidth>
+            </wp14:sizeRelH>
+            <wp14:sizeRelV relativeFrom="page">
+              <wp14:pctHeight>0</wp14:pctHeight>
+            </wp14:sizeRelV>
+          </wp:anchor>
+        </w:drawing>
+      </w:r>
+      <w:r>
+        <w:rPr>
+          <w:noProof/>
+        </w:rPr>
+        <w:drawing>
+          <wp:inline distT="0" distB="0" distL="0" distR="0" wp14:anchorId="117BC2A8" wp14:editId="5D0F0A7A">
+            <wp:extent cx="4563886" cy="5076497"/>
+            <wp:effectExtent l="0" t="0" r="8255" b="0"/>
+            <wp:docPr id="501161500" name="Grafik 18"/>
+            <wp:cNvGraphicFramePr>
+              <a:graphicFrameLocks xmlns:a="http://schemas.openxmlformats.org/drawingml/2006/main" noChangeAspect="1"/>
+            </wp:cNvGraphicFramePr>
+            <a:graphic xmlns:a="http://schemas.openxmlformats.org/drawingml/2006/main">
+              <a:graphicData uri="http://schemas.openxmlformats.org/drawingml/2006/picture">
+                <pic:pic xmlns:pic="http://schemas.openxmlformats.org/drawingml/2006/picture">
+                  <pic:nvPicPr>
+                    <pic:cNvPr id="501161500" name="Grafik 18"/>
                     <pic:cNvPicPr/>
                   </pic:nvPicPr>
                   <pic:blipFill>
@@ -1348,7 +1759,7 @@
                   <pic:spPr>
                     <a:xfrm>
                       <a:off x="0" y="0"/>
-                      <a:ext cx="8244000" cy="14702557"/>
+                      <a:ext cx="4563886" cy="5076497"/>
                     </a:xfrm>
                     <a:prstGeom prst="rect">
                       <a:avLst/>
@@ -1357,121 +1768,8 @@
                 </pic:pic>
               </a:graphicData>
             </a:graphic>
-            <wp14:sizeRelH relativeFrom="page">
-              <wp14:pctWidth>0</wp14:pctWidth>
-            </wp14:sizeRelH>
-            <wp14:sizeRelV relativeFrom="page">
-              <wp14:pctHeight>0</wp14:pctHeight>
-            </wp14:sizeRelV>
-          </wp:anchor>
+          </wp:inline>
         </w:drawing>
-      </w:r>
-      <w:r>
-        <w:rPr>
-          <w:noProof/>
-        </w:rPr>
-        <mc:AlternateContent>
-          <mc:Choice Requires="wps">
-            <w:drawing>
-              <wp:anchor distT="45720" distB="45720" distL="114300" distR="114300" simplePos="0" relativeHeight="251591680" behindDoc="0" locked="0" layoutInCell="1" allowOverlap="1" wp14:anchorId="0B08DC96" wp14:editId="1D947A2A">
-                <wp:simplePos x="0" y="0"/>
-                <wp:positionH relativeFrom="margin">
-                  <wp:align>center</wp:align>
-                </wp:positionH>
-                <wp:positionV relativeFrom="paragraph">
-                  <wp:posOffset>8959215</wp:posOffset>
-                </wp:positionV>
-                <wp:extent cx="4312285" cy="1404620"/>
-                <wp:effectExtent l="0" t="0" r="0" b="0"/>
-                <wp:wrapSquare wrapText="bothSides"/>
-                <wp:docPr id="217" name="Textfeld 2"/>
-                <wp:cNvGraphicFramePr>
-                  <a:graphicFrameLocks xmlns:a="http://schemas.openxmlformats.org/drawingml/2006/main"/>
-                </wp:cNvGraphicFramePr>
-                <a:graphic xmlns:a="http://schemas.openxmlformats.org/drawingml/2006/main">
-                  <a:graphicData uri="http://schemas.microsoft.com/office/word/2010/wordprocessingShape">
-                    <wps:wsp>
-                      <wps:cNvSpPr txBox="1">
-                        <a:spLocks noChangeArrowheads="1"/>
-                      </wps:cNvSpPr>
-                      <wps:spPr bwMode="auto">
-                        <a:xfrm>
-                          <a:off x="0" y="0"/>
-                          <a:ext cx="4312285" cy="1404620"/>
-                        </a:xfrm>
-                        <a:prstGeom prst="rect">
-                          <a:avLst/>
-                        </a:prstGeom>
-                        <a:noFill/>
-                        <a:ln w="9525">
-                          <a:noFill/>
-                          <a:miter lim="800000"/>
-                          <a:headEnd/>
-                          <a:tailEnd/>
-                        </a:ln>
-                      </wps:spPr>
-                      <wps:txbx>
-                        <w:txbxContent>
-                          <w:p>
-                            <w:pPr>
-                              <w:tabs>
-                                <w:tab w:val="left" w:pos="1843"/>
-                              </w:tabs>
-                              <w:jc w:val="center"/>
-                              <w:rPr>
-                                <w:b/>
-                                <w:bCs/>
-                                <w:sz w:val="48"/>
-                                <w:szCs w:val="48"/>
-                              </w:rPr>
-                            </w:pPr>
-                          </w:p>
-                        </w:txbxContent>
-                      </wps:txbx>
-                      <wps:bodyPr rot="0" vert="horz" wrap="square" lIns="91440" tIns="45720" rIns="91440" bIns="45720" anchor="t" anchorCtr="0">
-                        <a:spAutoFit/>
-                      </wps:bodyPr>
-                    </wps:wsp>
-                  </a:graphicData>
-                </a:graphic>
-                <wp14:sizeRelH relativeFrom="margin">
-                  <wp14:pctWidth>0</wp14:pctWidth>
-                </wp14:sizeRelH>
-                <wp14:sizeRelV relativeFrom="margin">
-                  <wp14:pctHeight>20000</wp14:pctHeight>
-                </wp14:sizeRelV>
-              </wp:anchor>
-            </w:drawing>
-          </mc:Choice>
-          <mc:Fallback>
-            <w:pict>
-              <v:shape w14:anchorId="0B08DC96" id="_x0000_s1031" type="#_x0000_t202" style="position:absolute;left:0;text-align:left;margin-left:0;margin-top:705.45pt;width:339.55pt;height:110.6pt;z-index:251591680;visibility:visible;mso-wrap-style:square;mso-width-percent:0;mso-height-percent:200;mso-wrap-distance-left:9pt;mso-wrap-distance-top:3.6pt;mso-wrap-distance-right:9pt;mso-wrap-distance-bottom:3.6pt;mso-position-horizontal:center;mso-position-horizontal-relative:margin;mso-position-vertical:absolute;mso-position-vertical-relative:text;mso-width-percent:0;mso-height-percent:200;mso-width-relative:margin;mso-height-relative:margin;v-text-anchor:top" o:gfxdata="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" filled="f" stroked="f">
-                <v:textbox style="mso-fit-shape-to-text:t">
-                  <w:txbxContent>
-                    <w:p>
-                      <w:pPr>
-                        <w:tabs>
-                          <w:tab w:val="left" w:pos="1843"/>
-                        </w:tabs>
-                        <w:jc w:val="center"/>
-                        <w:rPr>
-                          <w:b/>
-                          <w:bCs/>
-                          <w:sz w:val="48"/>
-                          <w:szCs w:val="48"/>
-                        </w:rPr>
-                      </w:pPr>
-                    </w:p>
-                  </w:txbxContent>
-                </v:textbox>
-                <w10:wrap type="square" anchorx="margin"/>
-              </v:shape>
-            </w:pict>
-          </mc:Fallback>
-        </mc:AlternateContent>
-      </w:r>
-      <w:r>
-        <w:t>,0</w:t>
       </w:r>
     </w:p>
     <w:sectPr>
@@ -2446,6 +2744,7 @@
   <w:style w:type="character" w:default="1" w:styleId="Absatz-Standardschriftart">
     <w:name w:val="Default Paragraph Font"/>
     <w:uiPriority w:val="1"/>
+    <w:semiHidden/>
     <w:unhideWhenUsed/>
   </w:style>
   <w:style w:type="table" w:default="1" w:styleId="NormaleTabelle">
@@ -2479,6 +2778,25 @@
       <w:ind w:left="720"/>
       <w:contextualSpacing/>
     </w:pPr>
+  </w:style>
+  <w:style w:type="table" w:styleId="Tabellenraster">
+    <w:name w:val="Table Grid"/>
+    <w:basedOn w:val="NormaleTabelle"/>
+    <w:uiPriority w:val="39"/>
+    <w:rsid w:val="00552D64"/>
+    <w:pPr>
+      <w:spacing w:after="0" w:line="240" w:lineRule="auto"/>
+    </w:pPr>
+    <w:tblPr>
+      <w:tblBorders>
+        <w:top w:val="single" w:sz="4" w:space="0" w:color="auto"/>
+        <w:left w:val="single" w:sz="4" w:space="0" w:color="auto"/>
+        <w:bottom w:val="single" w:sz="4" w:space="0" w:color="auto"/>
+        <w:right w:val="single" w:sz="4" w:space="0" w:color="auto"/>
+        <w:insideH w:val="single" w:sz="4" w:space="0" w:color="auto"/>
+        <w:insideV w:val="single" w:sz="4" w:space="0" w:color="auto"/>
+      </w:tblBorders>
+    </w:tblPr>
   </w:style>
 </w:styles>
 </file>

</xml_diff>